<commit_message>
Update slider links to external sites, regenerate Word doc and zip
- Slide 1 links to perspectivetester.com
- Slide 2 links to p15r.com
- Slide 3 links to a3s.app
- Word doc now shows slider section instead of old hero
- Zip includes all slider images and logos
</commit_message>
<xml_diff>
--- a/Perspective-Tester-Microsite-Content-Reference.docx
+++ b/Perspective-Tester-Microsite-Content-Reference.docx
@@ -214,7 +214,42 @@
           <w:sz w:val="26"/>
           <w:szCs w:val="26"/>
         </w:rPr>
-        <w:t xml:space="preserve">Hero Section</w:t>
+        <w:t xml:space="preserve">Image Slider (3 Slides)</w:t>
+      </w:r>
+    </w:p>
+    <w:p>
+      <w:pPr>
+        <w:spacing w:after="120"/>
+      </w:pPr>
+      <w:r>
+        <w:rPr>
+          <w:rFonts w:ascii="Arial" w:cs="Arial" w:eastAsia="Arial" w:hAnsi="Arial"/>
+          <w:sz w:val="21"/>
+          <w:szCs w:val="21"/>
+        </w:rPr>
+        <w:t xml:space="preserve">The homepage features a rotating image carousel with three slides:</w:t>
+      </w:r>
+    </w:p>
+    <w:p>
+      <w:pPr>
+        <w:spacing w:before="100"/>
+      </w:pPr>
+    </w:p>
+    <w:p>
+      <w:pPr>
+        <w:pStyle w:val="Heading3"/>
+        <w:spacing w:after="80" w:before="160"/>
+      </w:pPr>
+      <w:r>
+        <w:rPr>
+          <w:rFonts w:ascii="Arial" w:cs="Arial" w:eastAsia="Arial" w:hAnsi="Arial"/>
+          <w:b/>
+          <w:bCs/>
+          <w:color w:val="3155A4"/>
+          <w:sz w:val="22"/>
+          <w:szCs w:val="22"/>
+        </w:rPr>
+        <w:t xml:space="preserve">Slide 1 - Perspective Tester</w:t>
       </w:r>
     </w:p>
     <w:p>
@@ -229,15 +264,15 @@
           <w:sz w:val="21"/>
           <w:szCs w:val="21"/>
         </w:rPr>
-        <w:t xml:space="preserve">Brand: </w:t>
-      </w:r>
-      <w:r>
-        <w:rPr>
-          <w:rFonts w:ascii="Arial" w:cs="Arial" w:eastAsia="Arial" w:hAnsi="Arial"/>
-          <w:sz w:val="21"/>
-          <w:szCs w:val="21"/>
-        </w:rPr>
-        <w:t xml:space="preserve">Perspective Tester</w:t>
+        <w:t xml:space="preserve">Image: </w:t>
+      </w:r>
+      <w:r>
+        <w:rPr>
+          <w:rFonts w:ascii="Arial" w:cs="Arial" w:eastAsia="Arial" w:hAnsi="Arial"/>
+          <w:sz w:val="21"/>
+          <w:szCs w:val="21"/>
+        </w:rPr>
+        <w:t xml:space="preserve">art1.png</w:t>
       </w:r>
     </w:p>
     <w:p>
@@ -252,15 +287,15 @@
           <w:sz w:val="21"/>
           <w:szCs w:val="21"/>
         </w:rPr>
-        <w:t xml:space="preserve">Badge: </w:t>
-      </w:r>
-      <w:r>
-        <w:rPr>
-          <w:rFonts w:ascii="Arial" w:cs="Arial" w:eastAsia="Arial" w:hAnsi="Arial"/>
-          <w:sz w:val="21"/>
-          <w:szCs w:val="21"/>
-        </w:rPr>
-        <w:t xml:space="preserve">WCAG 2.2 AA</w:t>
+        <w:t xml:space="preserve">Alt Text: </w:t>
+      </w:r>
+      <w:r>
+        <w:rPr>
+          <w:rFonts w:ascii="Arial" w:cs="Arial" w:eastAsia="Arial" w:hAnsi="Arial"/>
+          <w:sz w:val="21"/>
+          <w:szCs w:val="21"/>
+        </w:rPr>
+        <w:t xml:space="preserve">Perspective Tester - Engineering Equity for the Digital World</w:t>
       </w:r>
     </w:p>
     <w:p>
@@ -275,15 +310,37 @@
           <w:sz w:val="21"/>
           <w:szCs w:val="21"/>
         </w:rPr>
-        <w:t xml:space="preserve">Tagline: </w:t>
-      </w:r>
-      <w:r>
-        <w:rPr>
-          <w:rFonts w:ascii="Arial" w:cs="Arial" w:eastAsia="Arial" w:hAnsi="Arial"/>
-          <w:sz w:val="21"/>
-          <w:szCs w:val="21"/>
-        </w:rPr>
-        <w:t xml:space="preserve">ENGINEERING EQUITY FOR THE DIGITAL WORLD</w:t>
+        <w:t xml:space="preserve">Links to: </w:t>
+      </w:r>
+      <w:r>
+        <w:rPr>
+          <w:rFonts w:ascii="Arial" w:cs="Arial" w:eastAsia="Arial" w:hAnsi="Arial"/>
+          <w:sz w:val="21"/>
+          <w:szCs w:val="21"/>
+        </w:rPr>
+        <w:t xml:space="preserve">https://www.perspectivetester.com</w:t>
+      </w:r>
+    </w:p>
+    <w:p>
+      <w:pPr>
+        <w:spacing w:before="100"/>
+      </w:pPr>
+    </w:p>
+    <w:p>
+      <w:pPr>
+        <w:pStyle w:val="Heading3"/>
+        <w:spacing w:after="80" w:before="160"/>
+      </w:pPr>
+      <w:r>
+        <w:rPr>
+          <w:rFonts w:ascii="Arial" w:cs="Arial" w:eastAsia="Arial" w:hAnsi="Arial"/>
+          <w:b/>
+          <w:bCs/>
+          <w:color w:val="3155A4"/>
+          <w:sz w:val="22"/>
+          <w:szCs w:val="22"/>
+        </w:rPr>
+        <w:t xml:space="preserve">Slide 2 - P15R</w:t>
       </w:r>
     </w:p>
     <w:p>
@@ -298,15 +355,15 @@
           <w:sz w:val="21"/>
           <w:szCs w:val="21"/>
         </w:rPr>
-        <w:t xml:space="preserve">Headline: </w:t>
-      </w:r>
-      <w:r>
-        <w:rPr>
-          <w:rFonts w:ascii="Arial" w:cs="Arial" w:eastAsia="Arial" w:hAnsi="Arial"/>
-          <w:sz w:val="21"/>
-          <w:szCs w:val="21"/>
-        </w:rPr>
-        <w:t xml:space="preserve">Accessibility Testing &amp; Compliance at Scale</w:t>
+        <w:t xml:space="preserve">Image: </w:t>
+      </w:r>
+      <w:r>
+        <w:rPr>
+          <w:rFonts w:ascii="Arial" w:cs="Arial" w:eastAsia="Arial" w:hAnsi="Arial"/>
+          <w:sz w:val="21"/>
+          <w:szCs w:val="21"/>
+        </w:rPr>
+        <w:t xml:space="preserve">art2.png</w:t>
       </w:r>
     </w:p>
     <w:p>
@@ -321,15 +378,15 @@
           <w:sz w:val="21"/>
           <w:szCs w:val="21"/>
         </w:rPr>
-        <w:t xml:space="preserve">Description: </w:t>
-      </w:r>
-      <w:r>
-        <w:rPr>
-          <w:rFonts w:ascii="Arial" w:cs="Arial" w:eastAsia="Arial" w:hAnsi="Arial"/>
-          <w:sz w:val="21"/>
-          <w:szCs w:val="21"/>
-        </w:rPr>
-        <w:t xml:space="preserve">Achieve and maintain WCAG 2.2 compliance with enterprise-grade tooling</w:t>
+        <w:t xml:space="preserve">Alt Text: </w:t>
+      </w:r>
+      <w:r>
+        <w:rPr>
+          <w:rFonts w:ascii="Arial" w:cs="Arial" w:eastAsia="Arial" w:hAnsi="Arial"/>
+          <w:sz w:val="21"/>
+          <w:szCs w:val="21"/>
+        </w:rPr>
+        <w:t xml:space="preserve">P15R - Your Accessibility Operations Command Center</w:t>
       </w:r>
     </w:p>
     <w:p>
@@ -344,15 +401,37 @@
           <w:sz w:val="21"/>
           <w:szCs w:val="21"/>
         </w:rPr>
-        <w:t xml:space="preserve">Standards: </w:t>
-      </w:r>
-      <w:r>
-        <w:rPr>
-          <w:rFonts w:ascii="Arial" w:cs="Arial" w:eastAsia="Arial" w:hAnsi="Arial"/>
-          <w:sz w:val="21"/>
-          <w:szCs w:val="21"/>
-        </w:rPr>
-        <w:t xml:space="preserve">WCAG 2.2 | SECTION 508 | ADA TITLE II</w:t>
+        <w:t xml:space="preserve">Links to: </w:t>
+      </w:r>
+      <w:r>
+        <w:rPr>
+          <w:rFonts w:ascii="Arial" w:cs="Arial" w:eastAsia="Arial" w:hAnsi="Arial"/>
+          <w:sz w:val="21"/>
+          <w:szCs w:val="21"/>
+        </w:rPr>
+        <w:t xml:space="preserve">https://p15r.com</w:t>
+      </w:r>
+    </w:p>
+    <w:p>
+      <w:pPr>
+        <w:spacing w:before="100"/>
+      </w:pPr>
+    </w:p>
+    <w:p>
+      <w:pPr>
+        <w:pStyle w:val="Heading3"/>
+        <w:spacing w:after="80" w:before="160"/>
+      </w:pPr>
+      <w:r>
+        <w:rPr>
+          <w:rFonts w:ascii="Arial" w:cs="Arial" w:eastAsia="Arial" w:hAnsi="Arial"/>
+          <w:b/>
+          <w:bCs/>
+          <w:color w:val="3155A4"/>
+          <w:sz w:val="22"/>
+          <w:szCs w:val="22"/>
+        </w:rPr>
+        <w:t xml:space="preserve">Slide 3 - A3S</w:t>
       </w:r>
     </w:p>
     <w:p>
@@ -367,15 +446,81 @@
           <w:sz w:val="21"/>
           <w:szCs w:val="21"/>
         </w:rPr>
-        <w:t xml:space="preserve">Button: </w:t>
-      </w:r>
-      <w:r>
-        <w:rPr>
-          <w:rFonts w:ascii="Arial" w:cs="Arial" w:eastAsia="Arial" w:hAnsi="Arial"/>
-          <w:sz w:val="21"/>
-          <w:szCs w:val="21"/>
-        </w:rPr>
-        <w:t xml:space="preserve">Get a Free Audit</w:t>
+        <w:t xml:space="preserve">Image: </w:t>
+      </w:r>
+      <w:r>
+        <w:rPr>
+          <w:rFonts w:ascii="Arial" w:cs="Arial" w:eastAsia="Arial" w:hAnsi="Arial"/>
+          <w:sz w:val="21"/>
+          <w:szCs w:val="21"/>
+        </w:rPr>
+        <w:t xml:space="preserve">art3.png</w:t>
+      </w:r>
+    </w:p>
+    <w:p>
+      <w:pPr>
+        <w:spacing w:after="80"/>
+      </w:pPr>
+      <w:r>
+        <w:rPr>
+          <w:rFonts w:ascii="Arial" w:cs="Arial" w:eastAsia="Arial" w:hAnsi="Arial"/>
+          <w:b/>
+          <w:bCs/>
+          <w:sz w:val="21"/>
+          <w:szCs w:val="21"/>
+        </w:rPr>
+        <w:t xml:space="preserve">Alt Text: </w:t>
+      </w:r>
+      <w:r>
+        <w:rPr>
+          <w:rFonts w:ascii="Arial" w:cs="Arial" w:eastAsia="Arial" w:hAnsi="Arial"/>
+          <w:sz w:val="21"/>
+          <w:szCs w:val="21"/>
+        </w:rPr>
+        <w:t xml:space="preserve">A3S - Continuous Accessibility, Complete Compliance</w:t>
+      </w:r>
+    </w:p>
+    <w:p>
+      <w:pPr>
+        <w:spacing w:after="80"/>
+      </w:pPr>
+      <w:r>
+        <w:rPr>
+          <w:rFonts w:ascii="Arial" w:cs="Arial" w:eastAsia="Arial" w:hAnsi="Arial"/>
+          <w:b/>
+          <w:bCs/>
+          <w:sz w:val="21"/>
+          <w:szCs w:val="21"/>
+        </w:rPr>
+        <w:t xml:space="preserve">Links to: </w:t>
+      </w:r>
+      <w:r>
+        <w:rPr>
+          <w:rFonts w:ascii="Arial" w:cs="Arial" w:eastAsia="Arial" w:hAnsi="Arial"/>
+          <w:sz w:val="21"/>
+          <w:szCs w:val="21"/>
+        </w:rPr>
+        <w:t xml:space="preserve">https://www.a3s.app</w:t>
+      </w:r>
+    </w:p>
+    <w:p>
+      <w:pPr>
+        <w:spacing w:before="100"/>
+      </w:pPr>
+    </w:p>
+    <w:p>
+      <w:pPr>
+        <w:spacing w:after="120"/>
+      </w:pPr>
+      <w:r>
+        <w:rPr>
+          <w:rFonts w:ascii="Arial" w:cs="Arial" w:eastAsia="Arial" w:hAnsi="Arial"/>
+          <w:i/>
+          <w:iCs/>
+          <w:sz w:val="21"/>
+          <w:szCs w:val="21"/>
+        </w:rPr>
+        <w:t xml:space="preserve">Each slide image is included in the assets folder. The carousel auto-rotates and has navigation arrows and dot indicators.</w:t>
       </w:r>
     </w:p>
     <w:p>
@@ -3351,61 +3496,115 @@
           <w:sz w:val="21"/>
           <w:szCs w:val="21"/>
         </w:rPr>
-        <w:t xml:space="preserve">Perspective Tester logo (from Carahsoft CDN)</w:t>
-      </w:r>
-    </w:p>
-    <w:p>
-      <w:pPr>
-        <w:pStyle w:val="ListParagraph"/>
-        <w:numPr>
-          <w:ilvl w:val="0"/>
-          <w:numId w:val="2"/>
-        </w:numPr>
-        <w:spacing w:after="60"/>
-      </w:pPr>
-      <w:r>
-        <w:rPr>
-          <w:rFonts w:ascii="Arial" w:cs="Arial" w:eastAsia="Arial" w:hAnsi="Arial"/>
-          <w:sz w:val="21"/>
-          <w:szCs w:val="21"/>
-        </w:rPr>
-        <w:t xml:space="preserve">A3S circle logo (square format)</w:t>
-      </w:r>
-    </w:p>
-    <w:p>
-      <w:pPr>
-        <w:pStyle w:val="ListParagraph"/>
-        <w:numPr>
-          <w:ilvl w:val="0"/>
-          <w:numId w:val="2"/>
-        </w:numPr>
-        <w:spacing w:after="60"/>
-      </w:pPr>
-      <w:r>
-        <w:rPr>
-          <w:rFonts w:ascii="Arial" w:cs="Arial" w:eastAsia="Arial" w:hAnsi="Arial"/>
-          <w:sz w:val="21"/>
-          <w:szCs w:val="21"/>
-        </w:rPr>
-        <w:t xml:space="preserve">P15R target/cursor logo</w:t>
-      </w:r>
-    </w:p>
-    <w:p>
-      <w:pPr>
-        <w:pStyle w:val="ListParagraph"/>
-        <w:numPr>
-          <w:ilvl w:val="0"/>
-          <w:numId w:val="2"/>
-        </w:numPr>
-        <w:spacing w:after="60"/>
-      </w:pPr>
-      <w:r>
-        <w:rPr>
-          <w:rFonts w:ascii="Arial" w:cs="Arial" w:eastAsia="Arial" w:hAnsi="Arial"/>
-          <w:sz w:val="21"/>
-          <w:szCs w:val="21"/>
-        </w:rPr>
-        <w:t xml:space="preserve">Capitol building illustration (hero image)</w:t>
+        <w:t xml:space="preserve">perspective-tester-logo.png - Official Perspective Tester logo</w:t>
+      </w:r>
+    </w:p>
+    <w:p>
+      <w:pPr>
+        <w:pStyle w:val="ListParagraph"/>
+        <w:numPr>
+          <w:ilvl w:val="0"/>
+          <w:numId w:val="2"/>
+        </w:numPr>
+        <w:spacing w:after="60"/>
+      </w:pPr>
+      <w:r>
+        <w:rPr>
+          <w:rFonts w:ascii="Arial" w:cs="Arial" w:eastAsia="Arial" w:hAnsi="Arial"/>
+          <w:sz w:val="21"/>
+          <w:szCs w:val="21"/>
+        </w:rPr>
+        <w:t xml:space="preserve">a3s-logo.png - A3S circle logo</w:t>
+      </w:r>
+    </w:p>
+    <w:p>
+      <w:pPr>
+        <w:pStyle w:val="ListParagraph"/>
+        <w:numPr>
+          <w:ilvl w:val="0"/>
+          <w:numId w:val="2"/>
+        </w:numPr>
+        <w:spacing w:after="60"/>
+      </w:pPr>
+      <w:r>
+        <w:rPr>
+          <w:rFonts w:ascii="Arial" w:cs="Arial" w:eastAsia="Arial" w:hAnsi="Arial"/>
+          <w:sz w:val="21"/>
+          <w:szCs w:val="21"/>
+        </w:rPr>
+        <w:t xml:space="preserve">p15r-logo.png - P15R target/cursor logo</w:t>
+      </w:r>
+    </w:p>
+    <w:p>
+      <w:pPr>
+        <w:pStyle w:val="ListParagraph"/>
+        <w:numPr>
+          <w:ilvl w:val="0"/>
+          <w:numId w:val="2"/>
+        </w:numPr>
+        <w:spacing w:after="60"/>
+      </w:pPr>
+      <w:r>
+        <w:rPr>
+          <w:rFonts w:ascii="Arial" w:cs="Arial" w:eastAsia="Arial" w:hAnsi="Arial"/>
+          <w:sz w:val="21"/>
+          <w:szCs w:val="21"/>
+        </w:rPr>
+        <w:t xml:space="preserve">capitol-dome.png - Capitol building illustration</w:t>
+      </w:r>
+    </w:p>
+    <w:p>
+      <w:pPr>
+        <w:pStyle w:val="ListParagraph"/>
+        <w:numPr>
+          <w:ilvl w:val="0"/>
+          <w:numId w:val="2"/>
+        </w:numPr>
+        <w:spacing w:after="60"/>
+      </w:pPr>
+      <w:r>
+        <w:rPr>
+          <w:rFonts w:ascii="Arial" w:cs="Arial" w:eastAsia="Arial" w:hAnsi="Arial"/>
+          <w:sz w:val="21"/>
+          <w:szCs w:val="21"/>
+        </w:rPr>
+        <w:t xml:space="preserve">art1.png - Slider image 1 (Perspective Tester, links to perspectivetester.com)</w:t>
+      </w:r>
+    </w:p>
+    <w:p>
+      <w:pPr>
+        <w:pStyle w:val="ListParagraph"/>
+        <w:numPr>
+          <w:ilvl w:val="0"/>
+          <w:numId w:val="2"/>
+        </w:numPr>
+        <w:spacing w:after="60"/>
+      </w:pPr>
+      <w:r>
+        <w:rPr>
+          <w:rFonts w:ascii="Arial" w:cs="Arial" w:eastAsia="Arial" w:hAnsi="Arial"/>
+          <w:sz w:val="21"/>
+          <w:szCs w:val="21"/>
+        </w:rPr>
+        <w:t xml:space="preserve">art2.png - Slider image 2 (P15R, links to p15r.com)</w:t>
+      </w:r>
+    </w:p>
+    <w:p>
+      <w:pPr>
+        <w:pStyle w:val="ListParagraph"/>
+        <w:numPr>
+          <w:ilvl w:val="0"/>
+          <w:numId w:val="2"/>
+        </w:numPr>
+        <w:spacing w:after="60"/>
+      </w:pPr>
+      <w:r>
+        <w:rPr>
+          <w:rFonts w:ascii="Arial" w:cs="Arial" w:eastAsia="Arial" w:hAnsi="Arial"/>
+          <w:sz w:val="21"/>
+          <w:szCs w:val="21"/>
+        </w:rPr>
+        <w:t xml:space="preserve">art3.png - Slider image 3 (A3S, links to a3s.app)</w:t>
       </w:r>
     </w:p>
     <w:p>

</xml_diff>

<commit_message>
Fix Word doc lists - each section now has independent numbering
</commit_message>
<xml_diff>
--- a/Perspective-Tester-Microsite-Content-Reference.docx
+++ b/Perspective-Tester-Microsite-Content-Reference.docx
@@ -520,7 +520,7 @@
           <w:sz w:val="21"/>
           <w:szCs w:val="21"/>
         </w:rPr>
-        <w:t xml:space="preserve">Each slide image is included in the assets folder. The carousel auto-rotates and has navigation arrows and dot indicators.</w:t>
+        <w:t xml:space="preserve">Each slide image is included in the assets folder. The carousel auto-rotates with navigation arrows and dot indicators.</w:t>
       </w:r>
     </w:p>
     <w:p>
@@ -1193,7 +1193,7 @@
         <w:pStyle w:val="ListParagraph"/>
         <w:numPr>
           <w:ilvl w:val="0"/>
-          <w:numId w:val="2"/>
+          <w:numId w:val="4"/>
         </w:numPr>
         <w:spacing w:after="60"/>
       </w:pPr>
@@ -1211,7 +1211,7 @@
         <w:pStyle w:val="ListParagraph"/>
         <w:numPr>
           <w:ilvl w:val="0"/>
-          <w:numId w:val="2"/>
+          <w:numId w:val="4"/>
         </w:numPr>
         <w:spacing w:after="60"/>
       </w:pPr>
@@ -1229,7 +1229,7 @@
         <w:pStyle w:val="ListParagraph"/>
         <w:numPr>
           <w:ilvl w:val="0"/>
-          <w:numId w:val="2"/>
+          <w:numId w:val="4"/>
         </w:numPr>
         <w:spacing w:after="60"/>
       </w:pPr>
@@ -1247,7 +1247,7 @@
         <w:pStyle w:val="ListParagraph"/>
         <w:numPr>
           <w:ilvl w:val="0"/>
-          <w:numId w:val="2"/>
+          <w:numId w:val="4"/>
         </w:numPr>
         <w:spacing w:after="60"/>
       </w:pPr>
@@ -1265,7 +1265,7 @@
         <w:pStyle w:val="ListParagraph"/>
         <w:numPr>
           <w:ilvl w:val="0"/>
-          <w:numId w:val="2"/>
+          <w:numId w:val="4"/>
         </w:numPr>
         <w:spacing w:after="60"/>
       </w:pPr>
@@ -1283,7 +1283,7 @@
         <w:pStyle w:val="ListParagraph"/>
         <w:numPr>
           <w:ilvl w:val="0"/>
-          <w:numId w:val="2"/>
+          <w:numId w:val="4"/>
         </w:numPr>
         <w:spacing w:after="60"/>
       </w:pPr>
@@ -1301,7 +1301,7 @@
         <w:pStyle w:val="ListParagraph"/>
         <w:numPr>
           <w:ilvl w:val="0"/>
-          <w:numId w:val="2"/>
+          <w:numId w:val="4"/>
         </w:numPr>
         <w:spacing w:after="60"/>
       </w:pPr>
@@ -1319,7 +1319,7 @@
         <w:pStyle w:val="ListParagraph"/>
         <w:numPr>
           <w:ilvl w:val="0"/>
-          <w:numId w:val="2"/>
+          <w:numId w:val="4"/>
         </w:numPr>
         <w:spacing w:after="60"/>
       </w:pPr>
@@ -1337,7 +1337,7 @@
         <w:pStyle w:val="ListParagraph"/>
         <w:numPr>
           <w:ilvl w:val="0"/>
-          <w:numId w:val="2"/>
+          <w:numId w:val="4"/>
         </w:numPr>
         <w:spacing w:after="60"/>
       </w:pPr>
@@ -1355,7 +1355,7 @@
         <w:pStyle w:val="ListParagraph"/>
         <w:numPr>
           <w:ilvl w:val="0"/>
-          <w:numId w:val="2"/>
+          <w:numId w:val="4"/>
         </w:numPr>
         <w:spacing w:after="60"/>
       </w:pPr>
@@ -1394,7 +1394,7 @@
         <w:pStyle w:val="ListParagraph"/>
         <w:numPr>
           <w:ilvl w:val="0"/>
-          <w:numId w:val="2"/>
+          <w:numId w:val="5"/>
         </w:numPr>
         <w:spacing w:after="60"/>
       </w:pPr>
@@ -1412,7 +1412,7 @@
         <w:pStyle w:val="ListParagraph"/>
         <w:numPr>
           <w:ilvl w:val="0"/>
-          <w:numId w:val="2"/>
+          <w:numId w:val="5"/>
         </w:numPr>
         <w:spacing w:after="60"/>
       </w:pPr>
@@ -1430,7 +1430,7 @@
         <w:pStyle w:val="ListParagraph"/>
         <w:numPr>
           <w:ilvl w:val="0"/>
-          <w:numId w:val="2"/>
+          <w:numId w:val="5"/>
         </w:numPr>
         <w:spacing w:after="60"/>
       </w:pPr>
@@ -1448,7 +1448,7 @@
         <w:pStyle w:val="ListParagraph"/>
         <w:numPr>
           <w:ilvl w:val="0"/>
-          <w:numId w:val="2"/>
+          <w:numId w:val="5"/>
         </w:numPr>
         <w:spacing w:after="60"/>
       </w:pPr>
@@ -1466,7 +1466,7 @@
         <w:pStyle w:val="ListParagraph"/>
         <w:numPr>
           <w:ilvl w:val="0"/>
-          <w:numId w:val="2"/>
+          <w:numId w:val="5"/>
         </w:numPr>
         <w:spacing w:after="60"/>
       </w:pPr>
@@ -1598,7 +1598,7 @@
         <w:pStyle w:val="ListParagraph"/>
         <w:numPr>
           <w:ilvl w:val="0"/>
-          <w:numId w:val="2"/>
+          <w:numId w:val="6"/>
         </w:numPr>
         <w:spacing w:after="60"/>
       </w:pPr>
@@ -1616,7 +1616,7 @@
         <w:pStyle w:val="ListParagraph"/>
         <w:numPr>
           <w:ilvl w:val="0"/>
-          <w:numId w:val="2"/>
+          <w:numId w:val="6"/>
         </w:numPr>
         <w:spacing w:after="60"/>
       </w:pPr>
@@ -1634,7 +1634,7 @@
         <w:pStyle w:val="ListParagraph"/>
         <w:numPr>
           <w:ilvl w:val="0"/>
-          <w:numId w:val="2"/>
+          <w:numId w:val="6"/>
         </w:numPr>
         <w:spacing w:after="60"/>
       </w:pPr>
@@ -1673,7 +1673,7 @@
         <w:pStyle w:val="ListParagraph"/>
         <w:numPr>
           <w:ilvl w:val="0"/>
-          <w:numId w:val="3"/>
+          <w:numId w:val="7"/>
         </w:numPr>
         <w:spacing w:after="60"/>
       </w:pPr>
@@ -1691,7 +1691,7 @@
         <w:pStyle w:val="ListParagraph"/>
         <w:numPr>
           <w:ilvl w:val="0"/>
-          <w:numId w:val="3"/>
+          <w:numId w:val="7"/>
         </w:numPr>
         <w:spacing w:after="60"/>
       </w:pPr>
@@ -1709,7 +1709,7 @@
         <w:pStyle w:val="ListParagraph"/>
         <w:numPr>
           <w:ilvl w:val="0"/>
-          <w:numId w:val="3"/>
+          <w:numId w:val="7"/>
         </w:numPr>
         <w:spacing w:after="60"/>
       </w:pPr>
@@ -1727,7 +1727,7 @@
         <w:pStyle w:val="ListParagraph"/>
         <w:numPr>
           <w:ilvl w:val="0"/>
-          <w:numId w:val="3"/>
+          <w:numId w:val="7"/>
         </w:numPr>
         <w:spacing w:after="60"/>
       </w:pPr>
@@ -1766,7 +1766,7 @@
         <w:pStyle w:val="ListParagraph"/>
         <w:numPr>
           <w:ilvl w:val="0"/>
-          <w:numId w:val="2"/>
+          <w:numId w:val="8"/>
         </w:numPr>
         <w:spacing w:after="60"/>
       </w:pPr>
@@ -1784,7 +1784,7 @@
         <w:pStyle w:val="ListParagraph"/>
         <w:numPr>
           <w:ilvl w:val="0"/>
-          <w:numId w:val="2"/>
+          <w:numId w:val="8"/>
         </w:numPr>
         <w:spacing w:after="60"/>
       </w:pPr>
@@ -1802,7 +1802,7 @@
         <w:pStyle w:val="ListParagraph"/>
         <w:numPr>
           <w:ilvl w:val="0"/>
-          <w:numId w:val="2"/>
+          <w:numId w:val="8"/>
         </w:numPr>
         <w:spacing w:after="60"/>
       </w:pPr>
@@ -1820,7 +1820,7 @@
         <w:pStyle w:val="ListParagraph"/>
         <w:numPr>
           <w:ilvl w:val="0"/>
-          <w:numId w:val="2"/>
+          <w:numId w:val="8"/>
         </w:numPr>
         <w:spacing w:after="60"/>
       </w:pPr>
@@ -1838,7 +1838,7 @@
         <w:pStyle w:val="ListParagraph"/>
         <w:numPr>
           <w:ilvl w:val="0"/>
-          <w:numId w:val="2"/>
+          <w:numId w:val="8"/>
         </w:numPr>
         <w:spacing w:after="60"/>
       </w:pPr>
@@ -1856,7 +1856,7 @@
         <w:pStyle w:val="ListParagraph"/>
         <w:numPr>
           <w:ilvl w:val="0"/>
-          <w:numId w:val="2"/>
+          <w:numId w:val="8"/>
         </w:numPr>
         <w:spacing w:after="60"/>
       </w:pPr>
@@ -1874,7 +1874,7 @@
         <w:pStyle w:val="ListParagraph"/>
         <w:numPr>
           <w:ilvl w:val="0"/>
-          <w:numId w:val="2"/>
+          <w:numId w:val="8"/>
         </w:numPr>
         <w:spacing w:after="60"/>
       </w:pPr>
@@ -1892,7 +1892,7 @@
         <w:pStyle w:val="ListParagraph"/>
         <w:numPr>
           <w:ilvl w:val="0"/>
-          <w:numId w:val="2"/>
+          <w:numId w:val="8"/>
         </w:numPr>
         <w:spacing w:after="60"/>
       </w:pPr>
@@ -1910,7 +1910,7 @@
         <w:pStyle w:val="ListParagraph"/>
         <w:numPr>
           <w:ilvl w:val="0"/>
-          <w:numId w:val="2"/>
+          <w:numId w:val="8"/>
         </w:numPr>
         <w:spacing w:after="60"/>
       </w:pPr>
@@ -2009,7 +2009,7 @@
         <w:pStyle w:val="ListParagraph"/>
         <w:numPr>
           <w:ilvl w:val="0"/>
-          <w:numId w:val="3"/>
+          <w:numId w:val="9"/>
         </w:numPr>
         <w:spacing w:after="60"/>
       </w:pPr>
@@ -2027,7 +2027,7 @@
         <w:pStyle w:val="ListParagraph"/>
         <w:numPr>
           <w:ilvl w:val="0"/>
-          <w:numId w:val="3"/>
+          <w:numId w:val="9"/>
         </w:numPr>
         <w:spacing w:after="60"/>
       </w:pPr>
@@ -2045,7 +2045,7 @@
         <w:pStyle w:val="ListParagraph"/>
         <w:numPr>
           <w:ilvl w:val="0"/>
-          <w:numId w:val="3"/>
+          <w:numId w:val="9"/>
         </w:numPr>
         <w:spacing w:after="60"/>
       </w:pPr>
@@ -2063,7 +2063,7 @@
         <w:pStyle w:val="ListParagraph"/>
         <w:numPr>
           <w:ilvl w:val="0"/>
-          <w:numId w:val="3"/>
+          <w:numId w:val="9"/>
         </w:numPr>
         <w:spacing w:after="60"/>
       </w:pPr>
@@ -2081,7 +2081,7 @@
         <w:pStyle w:val="ListParagraph"/>
         <w:numPr>
           <w:ilvl w:val="0"/>
-          <w:numId w:val="3"/>
+          <w:numId w:val="9"/>
         </w:numPr>
         <w:spacing w:after="60"/>
       </w:pPr>
@@ -2099,7 +2099,7 @@
         <w:pStyle w:val="ListParagraph"/>
         <w:numPr>
           <w:ilvl w:val="0"/>
-          <w:numId w:val="3"/>
+          <w:numId w:val="9"/>
         </w:numPr>
         <w:spacing w:after="60"/>
       </w:pPr>
@@ -2139,7 +2139,7 @@
         <w:pStyle w:val="ListParagraph"/>
         <w:numPr>
           <w:ilvl w:val="0"/>
-          <w:numId w:val="3"/>
+          <w:numId w:val="10"/>
         </w:numPr>
         <w:spacing w:after="60"/>
       </w:pPr>
@@ -2157,7 +2157,7 @@
         <w:pStyle w:val="ListParagraph"/>
         <w:numPr>
           <w:ilvl w:val="0"/>
-          <w:numId w:val="3"/>
+          <w:numId w:val="10"/>
         </w:numPr>
         <w:spacing w:after="60"/>
       </w:pPr>
@@ -2175,7 +2175,7 @@
         <w:pStyle w:val="ListParagraph"/>
         <w:numPr>
           <w:ilvl w:val="0"/>
-          <w:numId w:val="3"/>
+          <w:numId w:val="10"/>
         </w:numPr>
         <w:spacing w:after="60"/>
       </w:pPr>
@@ -2193,7 +2193,7 @@
         <w:pStyle w:val="ListParagraph"/>
         <w:numPr>
           <w:ilvl w:val="0"/>
-          <w:numId w:val="3"/>
+          <w:numId w:val="10"/>
         </w:numPr>
         <w:spacing w:after="60"/>
       </w:pPr>
@@ -2233,7 +2233,7 @@
         <w:pStyle w:val="ListParagraph"/>
         <w:numPr>
           <w:ilvl w:val="0"/>
-          <w:numId w:val="2"/>
+          <w:numId w:val="11"/>
         </w:numPr>
         <w:spacing w:after="60"/>
       </w:pPr>
@@ -2251,7 +2251,7 @@
         <w:pStyle w:val="ListParagraph"/>
         <w:numPr>
           <w:ilvl w:val="0"/>
-          <w:numId w:val="2"/>
+          <w:numId w:val="11"/>
         </w:numPr>
         <w:spacing w:after="60"/>
       </w:pPr>
@@ -2269,7 +2269,7 @@
         <w:pStyle w:val="ListParagraph"/>
         <w:numPr>
           <w:ilvl w:val="0"/>
-          <w:numId w:val="2"/>
+          <w:numId w:val="11"/>
         </w:numPr>
         <w:spacing w:after="60"/>
       </w:pPr>
@@ -2287,7 +2287,7 @@
         <w:pStyle w:val="ListParagraph"/>
         <w:numPr>
           <w:ilvl w:val="0"/>
-          <w:numId w:val="2"/>
+          <w:numId w:val="11"/>
         </w:numPr>
         <w:spacing w:after="60"/>
       </w:pPr>
@@ -2395,7 +2395,7 @@
         <w:pStyle w:val="ListParagraph"/>
         <w:numPr>
           <w:ilvl w:val="0"/>
-          <w:numId w:val="2"/>
+          <w:numId w:val="12"/>
         </w:numPr>
         <w:spacing w:after="60"/>
       </w:pPr>
@@ -2413,7 +2413,7 @@
         <w:pStyle w:val="ListParagraph"/>
         <w:numPr>
           <w:ilvl w:val="0"/>
-          <w:numId w:val="2"/>
+          <w:numId w:val="12"/>
         </w:numPr>
         <w:spacing w:after="60"/>
       </w:pPr>
@@ -2431,7 +2431,7 @@
         <w:pStyle w:val="ListParagraph"/>
         <w:numPr>
           <w:ilvl w:val="0"/>
-          <w:numId w:val="2"/>
+          <w:numId w:val="12"/>
         </w:numPr>
         <w:spacing w:after="60"/>
       </w:pPr>
@@ -2449,7 +2449,7 @@
         <w:pStyle w:val="ListParagraph"/>
         <w:numPr>
           <w:ilvl w:val="0"/>
-          <w:numId w:val="2"/>
+          <w:numId w:val="12"/>
         </w:numPr>
         <w:spacing w:after="60"/>
       </w:pPr>
@@ -2467,7 +2467,7 @@
         <w:pStyle w:val="ListParagraph"/>
         <w:numPr>
           <w:ilvl w:val="0"/>
-          <w:numId w:val="2"/>
+          <w:numId w:val="12"/>
         </w:numPr>
         <w:spacing w:after="60"/>
       </w:pPr>
@@ -2485,7 +2485,7 @@
         <w:pStyle w:val="ListParagraph"/>
         <w:numPr>
           <w:ilvl w:val="0"/>
-          <w:numId w:val="2"/>
+          <w:numId w:val="12"/>
         </w:numPr>
         <w:spacing w:after="60"/>
       </w:pPr>
@@ -2503,7 +2503,7 @@
         <w:pStyle w:val="ListParagraph"/>
         <w:numPr>
           <w:ilvl w:val="0"/>
-          <w:numId w:val="2"/>
+          <w:numId w:val="12"/>
         </w:numPr>
         <w:spacing w:after="60"/>
       </w:pPr>
@@ -2521,7 +2521,7 @@
         <w:pStyle w:val="ListParagraph"/>
         <w:numPr>
           <w:ilvl w:val="0"/>
-          <w:numId w:val="2"/>
+          <w:numId w:val="12"/>
         </w:numPr>
         <w:spacing w:after="60"/>
       </w:pPr>
@@ -2539,7 +2539,7 @@
         <w:pStyle w:val="ListParagraph"/>
         <w:numPr>
           <w:ilvl w:val="0"/>
-          <w:numId w:val="2"/>
+          <w:numId w:val="12"/>
         </w:numPr>
         <w:spacing w:after="60"/>
       </w:pPr>
@@ -2557,7 +2557,7 @@
         <w:pStyle w:val="ListParagraph"/>
         <w:numPr>
           <w:ilvl w:val="0"/>
-          <w:numId w:val="2"/>
+          <w:numId w:val="12"/>
         </w:numPr>
         <w:spacing w:after="60"/>
       </w:pPr>
@@ -2575,7 +2575,7 @@
         <w:pStyle w:val="ListParagraph"/>
         <w:numPr>
           <w:ilvl w:val="0"/>
-          <w:numId w:val="2"/>
+          <w:numId w:val="12"/>
         </w:numPr>
         <w:spacing w:after="60"/>
       </w:pPr>
@@ -3047,7 +3047,7 @@
         <w:pStyle w:val="ListParagraph"/>
         <w:numPr>
           <w:ilvl w:val="0"/>
-          <w:numId w:val="2"/>
+          <w:numId w:val="13"/>
         </w:numPr>
         <w:spacing w:after="60"/>
       </w:pPr>
@@ -3065,7 +3065,7 @@
         <w:pStyle w:val="ListParagraph"/>
         <w:numPr>
           <w:ilvl w:val="0"/>
-          <w:numId w:val="2"/>
+          <w:numId w:val="13"/>
         </w:numPr>
         <w:spacing w:after="60"/>
       </w:pPr>
@@ -3083,7 +3083,7 @@
         <w:pStyle w:val="ListParagraph"/>
         <w:numPr>
           <w:ilvl w:val="0"/>
-          <w:numId w:val="2"/>
+          <w:numId w:val="13"/>
         </w:numPr>
         <w:spacing w:after="60"/>
       </w:pPr>
@@ -3101,7 +3101,7 @@
         <w:pStyle w:val="ListParagraph"/>
         <w:numPr>
           <w:ilvl w:val="0"/>
-          <w:numId w:val="2"/>
+          <w:numId w:val="13"/>
         </w:numPr>
         <w:spacing w:after="60"/>
       </w:pPr>
@@ -3199,7 +3199,7 @@
         <w:pStyle w:val="ListParagraph"/>
         <w:numPr>
           <w:ilvl w:val="0"/>
-          <w:numId w:val="2"/>
+          <w:numId w:val="14"/>
         </w:numPr>
         <w:spacing w:after="60"/>
       </w:pPr>
@@ -3217,7 +3217,7 @@
         <w:pStyle w:val="ListParagraph"/>
         <w:numPr>
           <w:ilvl w:val="0"/>
-          <w:numId w:val="2"/>
+          <w:numId w:val="14"/>
         </w:numPr>
         <w:spacing w:after="60"/>
       </w:pPr>
@@ -3235,7 +3235,7 @@
         <w:pStyle w:val="ListParagraph"/>
         <w:numPr>
           <w:ilvl w:val="0"/>
-          <w:numId w:val="2"/>
+          <w:numId w:val="14"/>
         </w:numPr>
         <w:spacing w:after="60"/>
       </w:pPr>
@@ -3253,7 +3253,7 @@
         <w:pStyle w:val="ListParagraph"/>
         <w:numPr>
           <w:ilvl w:val="0"/>
-          <w:numId w:val="2"/>
+          <w:numId w:val="14"/>
         </w:numPr>
         <w:spacing w:after="60"/>
       </w:pPr>
@@ -3271,7 +3271,7 @@
         <w:pStyle w:val="ListParagraph"/>
         <w:numPr>
           <w:ilvl w:val="0"/>
-          <w:numId w:val="2"/>
+          <w:numId w:val="14"/>
         </w:numPr>
         <w:spacing w:after="60"/>
       </w:pPr>
@@ -3289,7 +3289,7 @@
         <w:pStyle w:val="ListParagraph"/>
         <w:numPr>
           <w:ilvl w:val="0"/>
-          <w:numId w:val="2"/>
+          <w:numId w:val="14"/>
         </w:numPr>
         <w:spacing w:after="60"/>
       </w:pPr>
@@ -3307,7 +3307,7 @@
         <w:pStyle w:val="ListParagraph"/>
         <w:numPr>
           <w:ilvl w:val="0"/>
-          <w:numId w:val="2"/>
+          <w:numId w:val="14"/>
         </w:numPr>
         <w:spacing w:after="60"/>
       </w:pPr>
@@ -3325,7 +3325,7 @@
         <w:pStyle w:val="ListParagraph"/>
         <w:numPr>
           <w:ilvl w:val="0"/>
-          <w:numId w:val="2"/>
+          <w:numId w:val="14"/>
         </w:numPr>
         <w:spacing w:after="60"/>
       </w:pPr>
@@ -3486,7 +3486,7 @@
         <w:pStyle w:val="ListParagraph"/>
         <w:numPr>
           <w:ilvl w:val="0"/>
-          <w:numId w:val="2"/>
+          <w:numId w:val="15"/>
         </w:numPr>
         <w:spacing w:after="60"/>
       </w:pPr>
@@ -3504,7 +3504,7 @@
         <w:pStyle w:val="ListParagraph"/>
         <w:numPr>
           <w:ilvl w:val="0"/>
-          <w:numId w:val="2"/>
+          <w:numId w:val="15"/>
         </w:numPr>
         <w:spacing w:after="60"/>
       </w:pPr>
@@ -3522,7 +3522,7 @@
         <w:pStyle w:val="ListParagraph"/>
         <w:numPr>
           <w:ilvl w:val="0"/>
-          <w:numId w:val="2"/>
+          <w:numId w:val="15"/>
         </w:numPr>
         <w:spacing w:after="60"/>
       </w:pPr>
@@ -3540,7 +3540,7 @@
         <w:pStyle w:val="ListParagraph"/>
         <w:numPr>
           <w:ilvl w:val="0"/>
-          <w:numId w:val="2"/>
+          <w:numId w:val="15"/>
         </w:numPr>
         <w:spacing w:after="60"/>
       </w:pPr>
@@ -3558,7 +3558,7 @@
         <w:pStyle w:val="ListParagraph"/>
         <w:numPr>
           <w:ilvl w:val="0"/>
-          <w:numId w:val="2"/>
+          <w:numId w:val="15"/>
         </w:numPr>
         <w:spacing w:after="60"/>
       </w:pPr>
@@ -3576,7 +3576,7 @@
         <w:pStyle w:val="ListParagraph"/>
         <w:numPr>
           <w:ilvl w:val="0"/>
-          <w:numId w:val="2"/>
+          <w:numId w:val="15"/>
         </w:numPr>
         <w:spacing w:after="60"/>
       </w:pPr>
@@ -3594,7 +3594,7 @@
         <w:pStyle w:val="ListParagraph"/>
         <w:numPr>
           <w:ilvl w:val="0"/>
-          <w:numId w:val="2"/>
+          <w:numId w:val="15"/>
         </w:numPr>
         <w:spacing w:after="60"/>
       </w:pPr>
@@ -3876,8 +3876,200 @@
     <w:multiLevelType w:val="hybridMultilevel"/>
     <w:lvl w:ilvl="0" w15:tentative="1">
       <w:start w:val="1"/>
+      <w:numFmt w:val="bullet"/>
+      <w:lvlText w:val="•"/>
+      <w:lvlJc w:val="left"/>
+      <w:pPr>
+        <w:ind w:left="720" w:hanging="360"/>
+      </w:pPr>
+    </w:lvl>
+  </w:abstractNum>
+  <w:abstractNum w:abstractNumId="4" w15:restartNumberingAfterBreak="0">
+    <w:multiLevelType w:val="hybridMultilevel"/>
+    <w:lvl w:ilvl="0" w15:tentative="1">
+      <w:start w:val="1"/>
+      <w:numFmt w:val="bullet"/>
+      <w:lvlText w:val="•"/>
+      <w:lvlJc w:val="left"/>
+      <w:pPr>
+        <w:ind w:left="720" w:hanging="360"/>
+      </w:pPr>
+    </w:lvl>
+  </w:abstractNum>
+  <w:abstractNum w:abstractNumId="5" w15:restartNumberingAfterBreak="0">
+    <w:multiLevelType w:val="hybridMultilevel"/>
+    <w:lvl w:ilvl="0" w15:tentative="1">
+      <w:start w:val="1"/>
+      <w:numFmt w:val="bullet"/>
+      <w:lvlText w:val="•"/>
+      <w:lvlJc w:val="left"/>
+      <w:pPr>
+        <w:ind w:left="720" w:hanging="360"/>
+      </w:pPr>
+    </w:lvl>
+  </w:abstractNum>
+  <w:abstractNum w:abstractNumId="6" w15:restartNumberingAfterBreak="0">
+    <w:multiLevelType w:val="hybridMultilevel"/>
+    <w:lvl w:ilvl="0" w15:tentative="1">
+      <w:start w:val="1"/>
       <w:numFmt w:val="decimal"/>
       <w:lvlText w:val="%1."/>
+      <w:lvlJc w:val="left"/>
+      <w:pPr>
+        <w:ind w:left="720" w:hanging="360"/>
+      </w:pPr>
+    </w:lvl>
+  </w:abstractNum>
+  <w:abstractNum w:abstractNumId="7" w15:restartNumberingAfterBreak="0">
+    <w:multiLevelType w:val="hybridMultilevel"/>
+    <w:lvl w:ilvl="0" w15:tentative="1">
+      <w:start w:val="1"/>
+      <w:numFmt w:val="bullet"/>
+      <w:lvlText w:val="•"/>
+      <w:lvlJc w:val="left"/>
+      <w:pPr>
+        <w:ind w:left="720" w:hanging="360"/>
+      </w:pPr>
+    </w:lvl>
+  </w:abstractNum>
+  <w:abstractNum w:abstractNumId="8" w15:restartNumberingAfterBreak="0">
+    <w:multiLevelType w:val="hybridMultilevel"/>
+    <w:lvl w:ilvl="0" w15:tentative="1">
+      <w:start w:val="1"/>
+      <w:numFmt w:val="bullet"/>
+      <w:lvlText w:val="•"/>
+      <w:lvlJc w:val="left"/>
+      <w:pPr>
+        <w:ind w:left="720" w:hanging="360"/>
+      </w:pPr>
+    </w:lvl>
+  </w:abstractNum>
+  <w:abstractNum w:abstractNumId="9" w15:restartNumberingAfterBreak="0">
+    <w:multiLevelType w:val="hybridMultilevel"/>
+    <w:lvl w:ilvl="0" w15:tentative="1">
+      <w:start w:val="1"/>
+      <w:numFmt w:val="bullet"/>
+      <w:lvlText w:val="•"/>
+      <w:lvlJc w:val="left"/>
+      <w:pPr>
+        <w:ind w:left="720" w:hanging="360"/>
+      </w:pPr>
+    </w:lvl>
+  </w:abstractNum>
+  <w:abstractNum w:abstractNumId="10" w15:restartNumberingAfterBreak="0">
+    <w:multiLevelType w:val="hybridMultilevel"/>
+    <w:lvl w:ilvl="0" w15:tentative="1">
+      <w:start w:val="1"/>
+      <w:numFmt w:val="decimal"/>
+      <w:lvlText w:val="%1."/>
+      <w:lvlJc w:val="left"/>
+      <w:pPr>
+        <w:ind w:left="720" w:hanging="360"/>
+      </w:pPr>
+    </w:lvl>
+  </w:abstractNum>
+  <w:abstractNum w:abstractNumId="11" w15:restartNumberingAfterBreak="0">
+    <w:multiLevelType w:val="hybridMultilevel"/>
+    <w:lvl w:ilvl="0" w15:tentative="1">
+      <w:start w:val="1"/>
+      <w:numFmt w:val="bullet"/>
+      <w:lvlText w:val="•"/>
+      <w:lvlJc w:val="left"/>
+      <w:pPr>
+        <w:ind w:left="720" w:hanging="360"/>
+      </w:pPr>
+    </w:lvl>
+  </w:abstractNum>
+  <w:abstractNum w:abstractNumId="12" w15:restartNumberingAfterBreak="0">
+    <w:multiLevelType w:val="hybridMultilevel"/>
+    <w:lvl w:ilvl="0" w15:tentative="1">
+      <w:start w:val="1"/>
+      <w:numFmt w:val="decimal"/>
+      <w:lvlText w:val="%1."/>
+      <w:lvlJc w:val="left"/>
+      <w:pPr>
+        <w:ind w:left="720" w:hanging="360"/>
+      </w:pPr>
+    </w:lvl>
+  </w:abstractNum>
+  <w:abstractNum w:abstractNumId="13" w15:restartNumberingAfterBreak="0">
+    <w:multiLevelType w:val="hybridMultilevel"/>
+    <w:lvl w:ilvl="0" w15:tentative="1">
+      <w:start w:val="1"/>
+      <w:numFmt w:val="decimal"/>
+      <w:lvlText w:val="%1."/>
+      <w:lvlJc w:val="left"/>
+      <w:pPr>
+        <w:ind w:left="720" w:hanging="360"/>
+      </w:pPr>
+    </w:lvl>
+  </w:abstractNum>
+  <w:abstractNum w:abstractNumId="14" w15:restartNumberingAfterBreak="0">
+    <w:multiLevelType w:val="hybridMultilevel"/>
+    <w:lvl w:ilvl="0" w15:tentative="1">
+      <w:start w:val="1"/>
+      <w:numFmt w:val="bullet"/>
+      <w:lvlText w:val="•"/>
+      <w:lvlJc w:val="left"/>
+      <w:pPr>
+        <w:ind w:left="720" w:hanging="360"/>
+      </w:pPr>
+    </w:lvl>
+  </w:abstractNum>
+  <w:abstractNum w:abstractNumId="15" w15:restartNumberingAfterBreak="0">
+    <w:multiLevelType w:val="hybridMultilevel"/>
+    <w:lvl w:ilvl="0" w15:tentative="1">
+      <w:start w:val="1"/>
+      <w:numFmt w:val="bullet"/>
+      <w:lvlText w:val="•"/>
+      <w:lvlJc w:val="left"/>
+      <w:pPr>
+        <w:ind w:left="720" w:hanging="360"/>
+      </w:pPr>
+    </w:lvl>
+  </w:abstractNum>
+  <w:abstractNum w:abstractNumId="16" w15:restartNumberingAfterBreak="0">
+    <w:multiLevelType w:val="hybridMultilevel"/>
+    <w:lvl w:ilvl="0" w15:tentative="1">
+      <w:start w:val="1"/>
+      <w:numFmt w:val="bullet"/>
+      <w:lvlText w:val="•"/>
+      <w:lvlJc w:val="left"/>
+      <w:pPr>
+        <w:ind w:left="720" w:hanging="360"/>
+      </w:pPr>
+    </w:lvl>
+  </w:abstractNum>
+  <w:abstractNum w:abstractNumId="17" w15:restartNumberingAfterBreak="0">
+    <w:multiLevelType w:val="hybridMultilevel"/>
+    <w:lvl w:ilvl="0" w15:tentative="1">
+      <w:start w:val="1"/>
+      <w:numFmt w:val="bullet"/>
+      <w:lvlText w:val="•"/>
+      <w:lvlJc w:val="left"/>
+      <w:pPr>
+        <w:ind w:left="720" w:hanging="360"/>
+      </w:pPr>
+    </w:lvl>
+  </w:abstractNum>
+  <w:abstractNum w:abstractNumId="18" w15:restartNumberingAfterBreak="0">
+    <w:multiLevelType w:val="hybridMultilevel"/>
+    <w:lvl w:ilvl="0" w15:tentative="1">
+      <w:start w:val="1"/>
+      <w:numFmt w:val="bullet"/>
+      <w:lvlText w:val="•"/>
+      <w:lvlJc w:val="left"/>
+      <w:pPr>
+        <w:ind w:left="720" w:hanging="360"/>
+      </w:pPr>
+    </w:lvl>
+  </w:abstractNum>
+  <w:abstractNum w:abstractNumId="19" w15:restartNumberingAfterBreak="0">
+    <w:multiLevelType w:val="hybridMultilevel"/>
+    <w:lvl w:ilvl="0" w15:tentative="1">
+      <w:start w:val="1"/>
+      <w:numFmt w:val="bullet"/>
+      <w:lvlText w:val="•"/>
       <w:lvlJc w:val="left"/>
       <w:pPr>
         <w:ind w:left="720" w:hanging="360"/>
@@ -3891,13 +4083,85 @@
     </w:lvlOverride>
   </w:num>
   <w:num w:numId="2">
-    <w:abstractNumId w:val="2"/>
+    <w:abstractNumId w:val="5"/>
     <w:lvlOverride w:ilvl="0">
       <w:startOverride w:val="1"/>
     </w:lvlOverride>
   </w:num>
   <w:num w:numId="3">
-    <w:abstractNumId w:val="3"/>
+    <w:abstractNumId w:val="6"/>
+    <w:lvlOverride w:ilvl="0">
+      <w:startOverride w:val="1"/>
+    </w:lvlOverride>
+  </w:num>
+  <w:num w:numId="4">
+    <w:abstractNumId w:val="7"/>
+    <w:lvlOverride w:ilvl="0">
+      <w:startOverride w:val="1"/>
+    </w:lvlOverride>
+  </w:num>
+  <w:num w:numId="5">
+    <w:abstractNumId w:val="8"/>
+    <w:lvlOverride w:ilvl="0">
+      <w:startOverride w:val="1"/>
+    </w:lvlOverride>
+  </w:num>
+  <w:num w:numId="6">
+    <w:abstractNumId w:val="9"/>
+    <w:lvlOverride w:ilvl="0">
+      <w:startOverride w:val="1"/>
+    </w:lvlOverride>
+  </w:num>
+  <w:num w:numId="7">
+    <w:abstractNumId w:val="10"/>
+    <w:lvlOverride w:ilvl="0">
+      <w:startOverride w:val="1"/>
+    </w:lvlOverride>
+  </w:num>
+  <w:num w:numId="8">
+    <w:abstractNumId w:val="11"/>
+    <w:lvlOverride w:ilvl="0">
+      <w:startOverride w:val="1"/>
+    </w:lvlOverride>
+  </w:num>
+  <w:num w:numId="9">
+    <w:abstractNumId w:val="12"/>
+    <w:lvlOverride w:ilvl="0">
+      <w:startOverride w:val="1"/>
+    </w:lvlOverride>
+  </w:num>
+  <w:num w:numId="10">
+    <w:abstractNumId w:val="13"/>
+    <w:lvlOverride w:ilvl="0">
+      <w:startOverride w:val="1"/>
+    </w:lvlOverride>
+  </w:num>
+  <w:num w:numId="11">
+    <w:abstractNumId w:val="14"/>
+    <w:lvlOverride w:ilvl="0">
+      <w:startOverride w:val="1"/>
+    </w:lvlOverride>
+  </w:num>
+  <w:num w:numId="12">
+    <w:abstractNumId w:val="16"/>
+    <w:lvlOverride w:ilvl="0">
+      <w:startOverride w:val="1"/>
+    </w:lvlOverride>
+  </w:num>
+  <w:num w:numId="13">
+    <w:abstractNumId w:val="17"/>
+    <w:lvlOverride w:ilvl="0">
+      <w:startOverride w:val="1"/>
+    </w:lvlOverride>
+  </w:num>
+  <w:num w:numId="14">
+    <w:abstractNumId w:val="18"/>
+    <w:lvlOverride w:ilvl="0">
+      <w:startOverride w:val="1"/>
+    </w:lvlOverride>
+  </w:num>
+  <w:num w:numId="15">
+    <w:abstractNumId w:val="19"/>
     <w:lvlOverride w:ilvl="0">
       <w:startOverride w:val="1"/>
     </w:lvlOverride>

</xml_diff>

<commit_message>
Regenerate Word doc with verified accurate content from all HTML files
- All text now matches HTML files exactly
- A3S phase deliverables included
- P15R capability descriptions are full text
- Services includes all 7 services with descriptions
- Contracts include contract numbers and dates
- Testimonial names/titles/orgs match exactly
- Schedule Demo uses correct heading and paragraph
- Slider links updated to external URLs
- Each list restarts numbering independently
</commit_message>
<xml_diff>
--- a/Perspective-Tester-Microsite-Content-Reference.docx
+++ b/Perspective-Tester-Microsite-Content-Reference.docx
@@ -510,26 +510,6 @@
     </w:p>
     <w:p>
       <w:pPr>
-        <w:spacing w:after="120"/>
-      </w:pPr>
-      <w:r>
-        <w:rPr>
-          <w:rFonts w:ascii="Arial" w:cs="Arial" w:eastAsia="Arial" w:hAnsi="Arial"/>
-          <w:i/>
-          <w:iCs/>
-          <w:sz w:val="21"/>
-          <w:szCs w:val="21"/>
-        </w:rPr>
-        <w:t xml:space="preserve">Each slide image is included in the assets folder. The carousel auto-rotates with navigation arrows and dot indicators.</w:t>
-      </w:r>
-    </w:p>
-    <w:p>
-      <w:pPr>
-        <w:spacing w:before="100"/>
-      </w:pPr>
-    </w:p>
-    <w:p>
-      <w:pPr>
         <w:pStyle w:val="Heading2"/>
         <w:spacing w:after="120" w:before="240"/>
       </w:pPr>
@@ -584,7 +564,7 @@
           <w:sz w:val="21"/>
           <w:szCs w:val="21"/>
         </w:rPr>
-        <w:t xml:space="preserve">We also provide full remediation services including document remediation for PDFs, Word documents, spreadsheets, and presentations - a complete turn-key solution for accessibility compliance. Achieve compliance for your websites, web systems, payment portals, mobile apps, custom software applications, documents, video content and more! Perspective Tester is your one-stop shop for all things related to digital accessibility.</w:t>
+        <w:t xml:space="preserve">We provide full remediation services - a complete turn-key solution for accessibility compliance. Achieve compliance for your websites, web systems, payment portals, mobile apps, custom software applications, documents, video content and more! Our services also include document remediation for PDFs, Word files, spreadsheets, and presentations, ensuring all your digital assets meet federal accessibility standards. Perspective Tester is your one-stop shop for all things related to digital accessibility.</w:t>
       </w:r>
     </w:p>
     <w:p>
@@ -1097,6 +1077,23 @@
     </w:p>
     <w:p>
       <w:pPr>
+        <w:pStyle w:val="Heading3"/>
+        <w:spacing w:after="80" w:before="160"/>
+      </w:pPr>
+      <w:r>
+        <w:rPr>
+          <w:rFonts w:ascii="Arial" w:cs="Arial" w:eastAsia="Arial" w:hAnsi="Arial"/>
+          <w:b/>
+          <w:bCs/>
+          <w:color w:val="3155A4"/>
+          <w:sz w:val="22"/>
+          <w:szCs w:val="22"/>
+        </w:rPr>
+        <w:t xml:space="preserve">Phase 1: Initial Assessment - Comprehensive Site Evaluation</w:t>
+      </w:r>
+    </w:p>
+    <w:p>
+      <w:pPr>
         <w:pStyle w:val="ListParagraph"/>
         <w:numPr>
           <w:ilvl w:val="0"/>
@@ -1110,7 +1107,7 @@
           <w:sz w:val="21"/>
           <w:szCs w:val="21"/>
         </w:rPr>
-        <w:t xml:space="preserve">Initial Assessment - Comprehensive Site Evaluation</w:t>
+        <w:t xml:space="preserve">Updated accessibility statement</w:t>
       </w:r>
     </w:p>
     <w:p>
@@ -1128,7 +1125,7 @@
           <w:sz w:val="21"/>
           <w:szCs w:val="21"/>
         </w:rPr>
-        <w:t xml:space="preserve">Audit &amp; Remediation - Comprehensive Progress Approach</w:t>
+        <w:t xml:space="preserve">Site complexity assessment</w:t>
       </w:r>
     </w:p>
     <w:p>
@@ -1146,7 +1143,7 @@
           <w:sz w:val="21"/>
           <w:szCs w:val="21"/>
         </w:rPr>
-        <w:t xml:space="preserve">Final Validation &amp; VPAT - Complete Compliance Verification</w:t>
+        <w:t xml:space="preserve">Technical architecture review</w:t>
       </w:r>
     </w:p>
     <w:p>
@@ -1164,7 +1161,289 @@
           <w:sz w:val="21"/>
           <w:szCs w:val="21"/>
         </w:rPr>
-        <w:t xml:space="preserve">Optimization &amp; Monitoring - Continuous Excellence</w:t>
+        <w:t xml:space="preserve">Project scope documentation</w:t>
+      </w:r>
+    </w:p>
+    <w:p>
+      <w:pPr>
+        <w:spacing w:before="100"/>
+      </w:pPr>
+    </w:p>
+    <w:p>
+      <w:pPr>
+        <w:pStyle w:val="Heading3"/>
+        <w:spacing w:after="80" w:before="160"/>
+      </w:pPr>
+      <w:r>
+        <w:rPr>
+          <w:rFonts w:ascii="Arial" w:cs="Arial" w:eastAsia="Arial" w:hAnsi="Arial"/>
+          <w:b/>
+          <w:bCs/>
+          <w:color w:val="3155A4"/>
+          <w:sz w:val="22"/>
+          <w:szCs w:val="22"/>
+        </w:rPr>
+        <w:t xml:space="preserve">Phase 2: Audit &amp; Remediation - Comprehensive Progress Approach</w:t>
+      </w:r>
+    </w:p>
+    <w:p>
+      <w:pPr>
+        <w:pStyle w:val="ListParagraph"/>
+        <w:numPr>
+          <w:ilvl w:val="0"/>
+          <w:numId w:val="4"/>
+        </w:numPr>
+        <w:spacing w:after="60"/>
+      </w:pPr>
+      <w:r>
+        <w:rPr>
+          <w:rFonts w:ascii="Arial" w:cs="Arial" w:eastAsia="Arial" w:hAnsi="Arial"/>
+          <w:sz w:val="21"/>
+          <w:szCs w:val="21"/>
+        </w:rPr>
+        <w:t xml:space="preserve">Issue identification and analysis</w:t>
+      </w:r>
+    </w:p>
+    <w:p>
+      <w:pPr>
+        <w:pStyle w:val="ListParagraph"/>
+        <w:numPr>
+          <w:ilvl w:val="0"/>
+          <w:numId w:val="4"/>
+        </w:numPr>
+        <w:spacing w:after="60"/>
+      </w:pPr>
+      <w:r>
+        <w:rPr>
+          <w:rFonts w:ascii="Arial" w:cs="Arial" w:eastAsia="Arial" w:hAnsi="Arial"/>
+          <w:sz w:val="21"/>
+          <w:szCs w:val="21"/>
+        </w:rPr>
+        <w:t xml:space="preserve">Comprehensive remediation implementation</w:t>
+      </w:r>
+    </w:p>
+    <w:p>
+      <w:pPr>
+        <w:pStyle w:val="ListParagraph"/>
+        <w:numPr>
+          <w:ilvl w:val="0"/>
+          <w:numId w:val="4"/>
+        </w:numPr>
+        <w:spacing w:after="60"/>
+      </w:pPr>
+      <w:r>
+        <w:rPr>
+          <w:rFonts w:ascii="Arial" w:cs="Arial" w:eastAsia="Arial" w:hAnsi="Arial"/>
+          <w:sz w:val="21"/>
+          <w:szCs w:val="21"/>
+        </w:rPr>
+        <w:t xml:space="preserve">Monthly progress reports</w:t>
+      </w:r>
+    </w:p>
+    <w:p>
+      <w:pPr>
+        <w:pStyle w:val="ListParagraph"/>
+        <w:numPr>
+          <w:ilvl w:val="0"/>
+          <w:numId w:val="4"/>
+        </w:numPr>
+        <w:spacing w:after="60"/>
+      </w:pPr>
+      <w:r>
+        <w:rPr>
+          <w:rFonts w:ascii="Arial" w:cs="Arial" w:eastAsia="Arial" w:hAnsi="Arial"/>
+          <w:sz w:val="21"/>
+          <w:szCs w:val="21"/>
+        </w:rPr>
+        <w:t xml:space="preserve">Updated accessibility statements</w:t>
+      </w:r>
+    </w:p>
+    <w:p>
+      <w:pPr>
+        <w:pStyle w:val="ListParagraph"/>
+        <w:numPr>
+          <w:ilvl w:val="0"/>
+          <w:numId w:val="4"/>
+        </w:numPr>
+        <w:spacing w:after="60"/>
+      </w:pPr>
+      <w:r>
+        <w:rPr>
+          <w:rFonts w:ascii="Arial" w:cs="Arial" w:eastAsia="Arial" w:hAnsi="Arial"/>
+          <w:sz w:val="21"/>
+          <w:szCs w:val="21"/>
+        </w:rPr>
+        <w:t xml:space="preserve">Third-party blocker documentation</w:t>
+      </w:r>
+    </w:p>
+    <w:p>
+      <w:pPr>
+        <w:spacing w:before="100"/>
+      </w:pPr>
+    </w:p>
+    <w:p>
+      <w:pPr>
+        <w:pStyle w:val="Heading3"/>
+        <w:spacing w:after="80" w:before="160"/>
+      </w:pPr>
+      <w:r>
+        <w:rPr>
+          <w:rFonts w:ascii="Arial" w:cs="Arial" w:eastAsia="Arial" w:hAnsi="Arial"/>
+          <w:b/>
+          <w:bCs/>
+          <w:color w:val="3155A4"/>
+          <w:sz w:val="22"/>
+          <w:szCs w:val="22"/>
+        </w:rPr>
+        <w:t xml:space="preserve">Phase 3: Final Validation &amp; VPAT - Complete Compliance Verification</w:t>
+      </w:r>
+    </w:p>
+    <w:p>
+      <w:pPr>
+        <w:pStyle w:val="ListParagraph"/>
+        <w:numPr>
+          <w:ilvl w:val="0"/>
+          <w:numId w:val="5"/>
+        </w:numPr>
+        <w:spacing w:after="60"/>
+      </w:pPr>
+      <w:r>
+        <w:rPr>
+          <w:rFonts w:ascii="Arial" w:cs="Arial" w:eastAsia="Arial" w:hAnsi="Arial"/>
+          <w:sz w:val="21"/>
+          <w:szCs w:val="21"/>
+        </w:rPr>
+        <w:t xml:space="preserve">Complete site validation</w:t>
+      </w:r>
+    </w:p>
+    <w:p>
+      <w:pPr>
+        <w:pStyle w:val="ListParagraph"/>
+        <w:numPr>
+          <w:ilvl w:val="0"/>
+          <w:numId w:val="5"/>
+        </w:numPr>
+        <w:spacing w:after="60"/>
+      </w:pPr>
+      <w:r>
+        <w:rPr>
+          <w:rFonts w:ascii="Arial" w:cs="Arial" w:eastAsia="Arial" w:hAnsi="Arial"/>
+          <w:sz w:val="21"/>
+          <w:szCs w:val="21"/>
+        </w:rPr>
+        <w:t xml:space="preserve">Official VPAT certification</w:t>
+      </w:r>
+    </w:p>
+    <w:p>
+      <w:pPr>
+        <w:pStyle w:val="ListParagraph"/>
+        <w:numPr>
+          <w:ilvl w:val="0"/>
+          <w:numId w:val="5"/>
+        </w:numPr>
+        <w:spacing w:after="60"/>
+      </w:pPr>
+      <w:r>
+        <w:rPr>
+          <w:rFonts w:ascii="Arial" w:cs="Arial" w:eastAsia="Arial" w:hAnsi="Arial"/>
+          <w:sz w:val="21"/>
+          <w:szCs w:val="21"/>
+        </w:rPr>
+        <w:t xml:space="preserve">Updated accessibility statement</w:t>
+      </w:r>
+    </w:p>
+    <w:p>
+      <w:pPr>
+        <w:spacing w:before="100"/>
+      </w:pPr>
+    </w:p>
+    <w:p>
+      <w:pPr>
+        <w:pStyle w:val="Heading3"/>
+        <w:spacing w:after="80" w:before="160"/>
+      </w:pPr>
+      <w:r>
+        <w:rPr>
+          <w:rFonts w:ascii="Arial" w:cs="Arial" w:eastAsia="Arial" w:hAnsi="Arial"/>
+          <w:b/>
+          <w:bCs/>
+          <w:color w:val="3155A4"/>
+          <w:sz w:val="22"/>
+          <w:szCs w:val="22"/>
+        </w:rPr>
+        <w:t xml:space="preserve">Phase 4: Optimization &amp; Monitoring - Continuous Excellence</w:t>
+      </w:r>
+    </w:p>
+    <w:p>
+      <w:pPr>
+        <w:pStyle w:val="ListParagraph"/>
+        <w:numPr>
+          <w:ilvl w:val="0"/>
+          <w:numId w:val="6"/>
+        </w:numPr>
+        <w:spacing w:after="60"/>
+      </w:pPr>
+      <w:r>
+        <w:rPr>
+          <w:rFonts w:ascii="Arial" w:cs="Arial" w:eastAsia="Arial" w:hAnsi="Arial"/>
+          <w:sz w:val="21"/>
+          <w:szCs w:val="21"/>
+        </w:rPr>
+        <w:t xml:space="preserve">Continuous site monitoring</w:t>
+      </w:r>
+    </w:p>
+    <w:p>
+      <w:pPr>
+        <w:pStyle w:val="ListParagraph"/>
+        <w:numPr>
+          <w:ilvl w:val="0"/>
+          <w:numId w:val="6"/>
+        </w:numPr>
+        <w:spacing w:after="60"/>
+      </w:pPr>
+      <w:r>
+        <w:rPr>
+          <w:rFonts w:ascii="Arial" w:cs="Arial" w:eastAsia="Arial" w:hAnsi="Arial"/>
+          <w:sz w:val="21"/>
+          <w:szCs w:val="21"/>
+        </w:rPr>
+        <w:t xml:space="preserve">Proactive issue prevention</w:t>
+      </w:r>
+    </w:p>
+    <w:p>
+      <w:pPr>
+        <w:pStyle w:val="ListParagraph"/>
+        <w:numPr>
+          <w:ilvl w:val="0"/>
+          <w:numId w:val="6"/>
+        </w:numPr>
+        <w:spacing w:after="60"/>
+      </w:pPr>
+      <w:r>
+        <w:rPr>
+          <w:rFonts w:ascii="Arial" w:cs="Arial" w:eastAsia="Arial" w:hAnsi="Arial"/>
+          <w:sz w:val="21"/>
+          <w:szCs w:val="21"/>
+        </w:rPr>
+        <w:t xml:space="preserve">Best practice implementation</w:t>
+      </w:r>
+    </w:p>
+    <w:p>
+      <w:pPr>
+        <w:pStyle w:val="ListParagraph"/>
+        <w:numPr>
+          <w:ilvl w:val="0"/>
+          <w:numId w:val="6"/>
+        </w:numPr>
+        <w:spacing w:after="60"/>
+      </w:pPr>
+      <w:r>
+        <w:rPr>
+          <w:rFonts w:ascii="Arial" w:cs="Arial" w:eastAsia="Arial" w:hAnsi="Arial"/>
+          <w:sz w:val="21"/>
+          <w:szCs w:val="21"/>
+        </w:rPr>
+        <w:t xml:space="preserve">Monthly accessibility statement updates</w:t>
       </w:r>
     </w:p>
     <w:p>
@@ -1193,7 +1472,7 @@
         <w:pStyle w:val="ListParagraph"/>
         <w:numPr>
           <w:ilvl w:val="0"/>
-          <w:numId w:val="4"/>
+          <w:numId w:val="7"/>
         </w:numPr>
         <w:spacing w:after="60"/>
       </w:pPr>
@@ -1211,7 +1490,7 @@
         <w:pStyle w:val="ListParagraph"/>
         <w:numPr>
           <w:ilvl w:val="0"/>
-          <w:numId w:val="4"/>
+          <w:numId w:val="7"/>
         </w:numPr>
         <w:spacing w:after="60"/>
       </w:pPr>
@@ -1229,7 +1508,7 @@
         <w:pStyle w:val="ListParagraph"/>
         <w:numPr>
           <w:ilvl w:val="0"/>
-          <w:numId w:val="4"/>
+          <w:numId w:val="7"/>
         </w:numPr>
         <w:spacing w:after="60"/>
       </w:pPr>
@@ -1247,7 +1526,7 @@
         <w:pStyle w:val="ListParagraph"/>
         <w:numPr>
           <w:ilvl w:val="0"/>
-          <w:numId w:val="4"/>
+          <w:numId w:val="7"/>
         </w:numPr>
         <w:spacing w:after="60"/>
       </w:pPr>
@@ -1265,7 +1544,7 @@
         <w:pStyle w:val="ListParagraph"/>
         <w:numPr>
           <w:ilvl w:val="0"/>
-          <w:numId w:val="4"/>
+          <w:numId w:val="7"/>
         </w:numPr>
         <w:spacing w:after="60"/>
       </w:pPr>
@@ -1283,7 +1562,7 @@
         <w:pStyle w:val="ListParagraph"/>
         <w:numPr>
           <w:ilvl w:val="0"/>
-          <w:numId w:val="4"/>
+          <w:numId w:val="7"/>
         </w:numPr>
         <w:spacing w:after="60"/>
       </w:pPr>
@@ -1301,7 +1580,7 @@
         <w:pStyle w:val="ListParagraph"/>
         <w:numPr>
           <w:ilvl w:val="0"/>
-          <w:numId w:val="4"/>
+          <w:numId w:val="7"/>
         </w:numPr>
         <w:spacing w:after="60"/>
       </w:pPr>
@@ -1319,7 +1598,7 @@
         <w:pStyle w:val="ListParagraph"/>
         <w:numPr>
           <w:ilvl w:val="0"/>
-          <w:numId w:val="4"/>
+          <w:numId w:val="7"/>
         </w:numPr>
         <w:spacing w:after="60"/>
       </w:pPr>
@@ -1337,7 +1616,7 @@
         <w:pStyle w:val="ListParagraph"/>
         <w:numPr>
           <w:ilvl w:val="0"/>
-          <w:numId w:val="4"/>
+          <w:numId w:val="7"/>
         </w:numPr>
         <w:spacing w:after="60"/>
       </w:pPr>
@@ -1355,7 +1634,7 @@
         <w:pStyle w:val="ListParagraph"/>
         <w:numPr>
           <w:ilvl w:val="0"/>
-          <w:numId w:val="4"/>
+          <w:numId w:val="7"/>
         </w:numPr>
         <w:spacing w:after="60"/>
       </w:pPr>
@@ -1394,89 +1673,89 @@
         <w:pStyle w:val="ListParagraph"/>
         <w:numPr>
           <w:ilvl w:val="0"/>
-          <w:numId w:val="5"/>
-        </w:numPr>
-        <w:spacing w:after="60"/>
-      </w:pPr>
-      <w:r>
-        <w:rPr>
-          <w:rFonts w:ascii="Arial" w:cs="Arial" w:eastAsia="Arial" w:hAnsi="Arial"/>
-          <w:sz w:val="21"/>
-          <w:szCs w:val="21"/>
-        </w:rPr>
-        <w:t xml:space="preserve">Accessibility Statement provided</w:t>
-      </w:r>
-    </w:p>
-    <w:p>
-      <w:pPr>
-        <w:pStyle w:val="ListParagraph"/>
-        <w:numPr>
-          <w:ilvl w:val="0"/>
-          <w:numId w:val="5"/>
-        </w:numPr>
-        <w:spacing w:after="60"/>
-      </w:pPr>
-      <w:r>
-        <w:rPr>
-          <w:rFonts w:ascii="Arial" w:cs="Arial" w:eastAsia="Arial" w:hAnsi="Arial"/>
-          <w:sz w:val="21"/>
-          <w:szCs w:val="21"/>
-        </w:rPr>
-        <w:t xml:space="preserve">Workflow Integration</w:t>
-      </w:r>
-    </w:p>
-    <w:p>
-      <w:pPr>
-        <w:pStyle w:val="ListParagraph"/>
-        <w:numPr>
-          <w:ilvl w:val="0"/>
-          <w:numId w:val="5"/>
-        </w:numPr>
-        <w:spacing w:after="60"/>
-      </w:pPr>
-      <w:r>
-        <w:rPr>
-          <w:rFonts w:ascii="Arial" w:cs="Arial" w:eastAsia="Arial" w:hAnsi="Arial"/>
-          <w:sz w:val="21"/>
-          <w:szCs w:val="21"/>
-        </w:rPr>
-        <w:t xml:space="preserve">Flexible Remediation Models</w:t>
-      </w:r>
-    </w:p>
-    <w:p>
-      <w:pPr>
-        <w:pStyle w:val="ListParagraph"/>
-        <w:numPr>
-          <w:ilvl w:val="0"/>
-          <w:numId w:val="5"/>
-        </w:numPr>
-        <w:spacing w:after="60"/>
-      </w:pPr>
-      <w:r>
-        <w:rPr>
-          <w:rFonts w:ascii="Arial" w:cs="Arial" w:eastAsia="Arial" w:hAnsi="Arial"/>
-          <w:sz w:val="21"/>
-          <w:szCs w:val="21"/>
-        </w:rPr>
-        <w:t xml:space="preserve">Legal Protection (ADA Title II, Section 504, Section 508, EN 301 549)</w:t>
-      </w:r>
-    </w:p>
-    <w:p>
-      <w:pPr>
-        <w:pStyle w:val="ListParagraph"/>
-        <w:numPr>
-          <w:ilvl w:val="0"/>
-          <w:numId w:val="5"/>
-        </w:numPr>
-        <w:spacing w:after="60"/>
-      </w:pPr>
-      <w:r>
-        <w:rPr>
-          <w:rFonts w:ascii="Arial" w:cs="Arial" w:eastAsia="Arial" w:hAnsi="Arial"/>
-          <w:sz w:val="21"/>
-          <w:szCs w:val="21"/>
-        </w:rPr>
-        <w:t xml:space="preserve">Defensible Documentation</w:t>
+          <w:numId w:val="8"/>
+        </w:numPr>
+        <w:spacing w:after="60"/>
+      </w:pPr>
+      <w:r>
+        <w:rPr>
+          <w:rFonts w:ascii="Arial" w:cs="Arial" w:eastAsia="Arial" w:hAnsi="Arial"/>
+          <w:sz w:val="21"/>
+          <w:szCs w:val="21"/>
+        </w:rPr>
+        <w:t xml:space="preserve">Accessibility Statement - We develop a customized accessibility statement that accurately represents your organization’s web presence. We keep it updated to show ongoing work, promoting public trust.</w:t>
+      </w:r>
+    </w:p>
+    <w:p>
+      <w:pPr>
+        <w:pStyle w:val="ListParagraph"/>
+        <w:numPr>
+          <w:ilvl w:val="0"/>
+          <w:numId w:val="8"/>
+        </w:numPr>
+        <w:spacing w:after="60"/>
+      </w:pPr>
+      <w:r>
+        <w:rPr>
+          <w:rFonts w:ascii="Arial" w:cs="Arial" w:eastAsia="Arial" w:hAnsi="Arial"/>
+          <w:sz w:val="21"/>
+          <w:szCs w:val="21"/>
+        </w:rPr>
+        <w:t xml:space="preserve">Workflow Integration - We adapt to your CMS, LMS, developer sprint cycles, and publishing workflows seamlessly.</w:t>
+      </w:r>
+    </w:p>
+    <w:p>
+      <w:pPr>
+        <w:pStyle w:val="ListParagraph"/>
+        <w:numPr>
+          <w:ilvl w:val="0"/>
+          <w:numId w:val="8"/>
+        </w:numPr>
+        <w:spacing w:after="60"/>
+      </w:pPr>
+      <w:r>
+        <w:rPr>
+          <w:rFonts w:ascii="Arial" w:cs="Arial" w:eastAsia="Arial" w:hAnsi="Arial"/>
+          <w:sz w:val="21"/>
+          <w:szCs w:val="21"/>
+        </w:rPr>
+        <w:t xml:space="preserve">Flexible Remediation Models - Choose from full-service, developer-driven, or hybrid support options tailored to your needs.</w:t>
+      </w:r>
+    </w:p>
+    <w:p>
+      <w:pPr>
+        <w:pStyle w:val="ListParagraph"/>
+        <w:numPr>
+          <w:ilvl w:val="0"/>
+          <w:numId w:val="8"/>
+        </w:numPr>
+        <w:spacing w:after="60"/>
+      </w:pPr>
+      <w:r>
+        <w:rPr>
+          <w:rFonts w:ascii="Arial" w:cs="Arial" w:eastAsia="Arial" w:hAnsi="Arial"/>
+          <w:sz w:val="21"/>
+          <w:szCs w:val="21"/>
+        </w:rPr>
+        <w:t xml:space="preserve">Legal Protection - Alignment with ADA Title II, Section 504, Section 508, relevant state laws, and EN 301 549 (EU).</w:t>
+      </w:r>
+    </w:p>
+    <w:p>
+      <w:pPr>
+        <w:pStyle w:val="ListParagraph"/>
+        <w:numPr>
+          <w:ilvl w:val="0"/>
+          <w:numId w:val="8"/>
+        </w:numPr>
+        <w:spacing w:after="60"/>
+      </w:pPr>
+      <w:r>
+        <w:rPr>
+          <w:rFonts w:ascii="Arial" w:cs="Arial" w:eastAsia="Arial" w:hAnsi="Arial"/>
+          <w:sz w:val="21"/>
+          <w:szCs w:val="21"/>
+        </w:rPr>
+        <w:t xml:space="preserve">Defensible Documentation - Ongoing reports and compliance evidence to reduce legal risk.</w:t>
       </w:r>
     </w:p>
     <w:p>
@@ -1598,7 +1877,7 @@
         <w:pStyle w:val="ListParagraph"/>
         <w:numPr>
           <w:ilvl w:val="0"/>
-          <w:numId w:val="6"/>
+          <w:numId w:val="9"/>
         </w:numPr>
         <w:spacing w:after="60"/>
       </w:pPr>
@@ -1616,7 +1895,7 @@
         <w:pStyle w:val="ListParagraph"/>
         <w:numPr>
           <w:ilvl w:val="0"/>
-          <w:numId w:val="6"/>
+          <w:numId w:val="9"/>
         </w:numPr>
         <w:spacing w:after="60"/>
       </w:pPr>
@@ -1634,7 +1913,7 @@
         <w:pStyle w:val="ListParagraph"/>
         <w:numPr>
           <w:ilvl w:val="0"/>
-          <w:numId w:val="6"/>
+          <w:numId w:val="9"/>
         </w:numPr>
         <w:spacing w:after="60"/>
       </w:pPr>
@@ -1673,7 +1952,7 @@
         <w:pStyle w:val="ListParagraph"/>
         <w:numPr>
           <w:ilvl w:val="0"/>
-          <w:numId w:val="7"/>
+          <w:numId w:val="10"/>
         </w:numPr>
         <w:spacing w:after="60"/>
       </w:pPr>
@@ -1691,7 +1970,7 @@
         <w:pStyle w:val="ListParagraph"/>
         <w:numPr>
           <w:ilvl w:val="0"/>
-          <w:numId w:val="7"/>
+          <w:numId w:val="10"/>
         </w:numPr>
         <w:spacing w:after="60"/>
       </w:pPr>
@@ -1709,7 +1988,7 @@
         <w:pStyle w:val="ListParagraph"/>
         <w:numPr>
           <w:ilvl w:val="0"/>
-          <w:numId w:val="7"/>
+          <w:numId w:val="10"/>
         </w:numPr>
         <w:spacing w:after="60"/>
       </w:pPr>
@@ -1727,7 +2006,7 @@
         <w:pStyle w:val="ListParagraph"/>
         <w:numPr>
           <w:ilvl w:val="0"/>
-          <w:numId w:val="7"/>
+          <w:numId w:val="10"/>
         </w:numPr>
         <w:spacing w:after="60"/>
       </w:pPr>
@@ -1766,161 +2045,161 @@
         <w:pStyle w:val="ListParagraph"/>
         <w:numPr>
           <w:ilvl w:val="0"/>
-          <w:numId w:val="8"/>
-        </w:numPr>
-        <w:spacing w:after="60"/>
-      </w:pPr>
-      <w:r>
-        <w:rPr>
-          <w:rFonts w:ascii="Arial" w:cs="Arial" w:eastAsia="Arial" w:hAnsi="Arial"/>
-          <w:sz w:val="21"/>
-          <w:szCs w:val="21"/>
-        </w:rPr>
-        <w:t xml:space="preserve">Smart Upload - Auto-map columns, parse findings (specific format required, not all spreadsheets)</w:t>
-      </w:r>
-    </w:p>
-    <w:p>
-      <w:pPr>
-        <w:pStyle w:val="ListParagraph"/>
-        <w:numPr>
-          <w:ilvl w:val="0"/>
-          <w:numId w:val="8"/>
-        </w:numPr>
-        <w:spacing w:after="60"/>
-      </w:pPr>
-      <w:r>
-        <w:rPr>
-          <w:rFonts w:ascii="Arial" w:cs="Arial" w:eastAsia="Arial" w:hAnsi="Arial"/>
-          <w:sz w:val="21"/>
-          <w:szCs w:val="21"/>
-        </w:rPr>
-        <w:t xml:space="preserve">Issue Tracking - Severity, WCAG criteria, ownership</w:t>
-      </w:r>
-    </w:p>
-    <w:p>
-      <w:pPr>
-        <w:pStyle w:val="ListParagraph"/>
-        <w:numPr>
-          <w:ilvl w:val="0"/>
-          <w:numId w:val="8"/>
-        </w:numPr>
-        <w:spacing w:after="60"/>
-      </w:pPr>
-      <w:r>
-        <w:rPr>
-          <w:rFonts w:ascii="Arial" w:cs="Arial" w:eastAsia="Arial" w:hAnsi="Arial"/>
-          <w:sz w:val="21"/>
-          <w:szCs w:val="21"/>
-        </w:rPr>
-        <w:t xml:space="preserve">Analytics - Real-time dashboards for remediation progress</w:t>
-      </w:r>
-    </w:p>
-    <w:p>
-      <w:pPr>
-        <w:pStyle w:val="ListParagraph"/>
-        <w:numPr>
-          <w:ilvl w:val="0"/>
-          <w:numId w:val="8"/>
-        </w:numPr>
-        <w:spacing w:after="60"/>
-      </w:pPr>
-      <w:r>
-        <w:rPr>
-          <w:rFonts w:ascii="Arial" w:cs="Arial" w:eastAsia="Arial" w:hAnsi="Arial"/>
-          <w:sz w:val="21"/>
-          <w:szCs w:val="21"/>
-        </w:rPr>
-        <w:t xml:space="preserve">Team Collaboration - RBAC with role-based permissions</w:t>
-      </w:r>
-    </w:p>
-    <w:p>
-      <w:pPr>
-        <w:pStyle w:val="ListParagraph"/>
-        <w:numPr>
-          <w:ilvl w:val="0"/>
-          <w:numId w:val="8"/>
-        </w:numPr>
-        <w:spacing w:after="60"/>
-      </w:pPr>
-      <w:r>
-        <w:rPr>
-          <w:rFonts w:ascii="Arial" w:cs="Arial" w:eastAsia="Arial" w:hAnsi="Arial"/>
-          <w:sz w:val="21"/>
-          <w:szCs w:val="21"/>
-        </w:rPr>
-        <w:t xml:space="preserve">Document Remediation - Track PDFs and document fixes</w:t>
-      </w:r>
-    </w:p>
-    <w:p>
-      <w:pPr>
-        <w:pStyle w:val="ListParagraph"/>
-        <w:numPr>
-          <w:ilvl w:val="0"/>
-          <w:numId w:val="8"/>
-        </w:numPr>
-        <w:spacing w:after="60"/>
-      </w:pPr>
-      <w:r>
-        <w:rPr>
-          <w:rFonts w:ascii="Arial" w:cs="Arial" w:eastAsia="Arial" w:hAnsi="Arial"/>
-          <w:sz w:val="21"/>
-          <w:szCs w:val="21"/>
-        </w:rPr>
-        <w:t xml:space="preserve">Compliance Calendar - Track deadlines and obligations</w:t>
-      </w:r>
-    </w:p>
-    <w:p>
-      <w:pPr>
-        <w:pStyle w:val="ListParagraph"/>
-        <w:numPr>
-          <w:ilvl w:val="0"/>
-          <w:numId w:val="8"/>
-        </w:numPr>
-        <w:spacing w:after="60"/>
-      </w:pPr>
-      <w:r>
-        <w:rPr>
-          <w:rFonts w:ascii="Arial" w:cs="Arial" w:eastAsia="Arial" w:hAnsi="Arial"/>
-          <w:sz w:val="21"/>
-          <w:szCs w:val="21"/>
-        </w:rPr>
-        <w:t xml:space="preserve">Jira Integration - Sync issues bidirectionally</w:t>
-      </w:r>
-    </w:p>
-    <w:p>
-      <w:pPr>
-        <w:pStyle w:val="ListParagraph"/>
-        <w:numPr>
-          <w:ilvl w:val="0"/>
-          <w:numId w:val="8"/>
-        </w:numPr>
-        <w:spacing w:after="60"/>
-      </w:pPr>
-      <w:r>
-        <w:rPr>
-          <w:rFonts w:ascii="Arial" w:cs="Arial" w:eastAsia="Arial" w:hAnsi="Arial"/>
-          <w:sz w:val="21"/>
-          <w:szCs w:val="21"/>
-        </w:rPr>
-        <w:t xml:space="preserve">Slack &amp; Teams Alerts - Real-time push notifications</w:t>
-      </w:r>
-    </w:p>
-    <w:p>
-      <w:pPr>
-        <w:pStyle w:val="ListParagraph"/>
-        <w:numPr>
-          <w:ilvl w:val="0"/>
-          <w:numId w:val="8"/>
-        </w:numPr>
-        <w:spacing w:after="60"/>
-      </w:pPr>
-      <w:r>
-        <w:rPr>
-          <w:rFonts w:ascii="Arial" w:cs="Arial" w:eastAsia="Arial" w:hAnsi="Arial"/>
-          <w:sz w:val="21"/>
-          <w:szCs w:val="21"/>
-        </w:rPr>
-        <w:t xml:space="preserve">Secure by Design - Password-protected links, granular share controls</w:t>
+          <w:numId w:val="11"/>
+        </w:numPr>
+        <w:spacing w:after="60"/>
+      </w:pPr>
+      <w:r>
+        <w:rPr>
+          <w:rFonts w:ascii="Arial" w:cs="Arial" w:eastAsia="Arial" w:hAnsi="Arial"/>
+          <w:sz w:val="21"/>
+          <w:szCs w:val="21"/>
+        </w:rPr>
+        <w:t xml:space="preserve">Smart Upload - Upload Excel audit reports and let P15R auto-map columns, parse findings, and structure issues in seconds.</w:t>
+      </w:r>
+    </w:p>
+    <w:p>
+      <w:pPr>
+        <w:pStyle w:val="ListParagraph"/>
+        <w:numPr>
+          <w:ilvl w:val="0"/>
+          <w:numId w:val="11"/>
+        </w:numPr>
+        <w:spacing w:after="60"/>
+      </w:pPr>
+      <w:r>
+        <w:rPr>
+          <w:rFonts w:ascii="Arial" w:cs="Arial" w:eastAsia="Arial" w:hAnsi="Arial"/>
+          <w:sz w:val="21"/>
+          <w:szCs w:val="21"/>
+        </w:rPr>
+        <w:t xml:space="preserve">Issue Tracking - Track every issue with severity, WCAG criteria, ownership, and due dates - all in one searchable view.</w:t>
+      </w:r>
+    </w:p>
+    <w:p>
+      <w:pPr>
+        <w:pStyle w:val="ListParagraph"/>
+        <w:numPr>
+          <w:ilvl w:val="0"/>
+          <w:numId w:val="11"/>
+        </w:numPr>
+        <w:spacing w:after="60"/>
+      </w:pPr>
+      <w:r>
+        <w:rPr>
+          <w:rFonts w:ascii="Arial" w:cs="Arial" w:eastAsia="Arial" w:hAnsi="Arial"/>
+          <w:sz w:val="21"/>
+          <w:szCs w:val="21"/>
+        </w:rPr>
+        <w:t xml:space="preserve">Analytics - Real-time dashboards for remediation progress, risk distribution, and status trends across your portfolio.</w:t>
+      </w:r>
+    </w:p>
+    <w:p>
+      <w:pPr>
+        <w:pStyle w:val="ListParagraph"/>
+        <w:numPr>
+          <w:ilvl w:val="0"/>
+          <w:numId w:val="11"/>
+        </w:numPr>
+        <w:spacing w:after="60"/>
+      </w:pPr>
+      <w:r>
+        <w:rPr>
+          <w:rFonts w:ascii="Arial" w:cs="Arial" w:eastAsia="Arial" w:hAnsi="Arial"/>
+          <w:sz w:val="21"/>
+          <w:szCs w:val="21"/>
+        </w:rPr>
+        <w:t xml:space="preserve">Team Collaboration - Invite members with role-based permissions and keep remediation ownership clear across every handoff.</w:t>
+      </w:r>
+    </w:p>
+    <w:p>
+      <w:pPr>
+        <w:pStyle w:val="ListParagraph"/>
+        <w:numPr>
+          <w:ilvl w:val="0"/>
+          <w:numId w:val="11"/>
+        </w:numPr>
+        <w:spacing w:after="60"/>
+      </w:pPr>
+      <w:r>
+        <w:rPr>
+          <w:rFonts w:ascii="Arial" w:cs="Arial" w:eastAsia="Arial" w:hAnsi="Arial"/>
+          <w:sz w:val="21"/>
+          <w:szCs w:val="21"/>
+        </w:rPr>
+        <w:t xml:space="preserve">Document Remediation - Track PDF and document fixes with full version history and vendor handoff visibility.</w:t>
+      </w:r>
+    </w:p>
+    <w:p>
+      <w:pPr>
+        <w:pStyle w:val="ListParagraph"/>
+        <w:numPr>
+          <w:ilvl w:val="0"/>
+          <w:numId w:val="11"/>
+        </w:numPr>
+        <w:spacing w:after="60"/>
+      </w:pPr>
+      <w:r>
+        <w:rPr>
+          <w:rFonts w:ascii="Arial" w:cs="Arial" w:eastAsia="Arial" w:hAnsi="Arial"/>
+          <w:sz w:val="21"/>
+          <w:szCs w:val="21"/>
+        </w:rPr>
+        <w:t xml:space="preserve">Compliance Calendar - Track regulatory deadlines and compliance obligations with Kanban and list views.</w:t>
+      </w:r>
+    </w:p>
+    <w:p>
+      <w:pPr>
+        <w:pStyle w:val="ListParagraph"/>
+        <w:numPr>
+          <w:ilvl w:val="0"/>
+          <w:numId w:val="11"/>
+        </w:numPr>
+        <w:spacing w:after="60"/>
+      </w:pPr>
+      <w:r>
+        <w:rPr>
+          <w:rFonts w:ascii="Arial" w:cs="Arial" w:eastAsia="Arial" w:hAnsi="Arial"/>
+          <w:sz w:val="21"/>
+          <w:szCs w:val="21"/>
+        </w:rPr>
+        <w:t xml:space="preserve">Jira Integration - Sync issues bidirectionally with Jira so accessibility findings live inside your existing project workflow.</w:t>
+      </w:r>
+    </w:p>
+    <w:p>
+      <w:pPr>
+        <w:pStyle w:val="ListParagraph"/>
+        <w:numPr>
+          <w:ilvl w:val="0"/>
+          <w:numId w:val="11"/>
+        </w:numPr>
+        <w:spacing w:after="60"/>
+      </w:pPr>
+      <w:r>
+        <w:rPr>
+          <w:rFonts w:ascii="Arial" w:cs="Arial" w:eastAsia="Arial" w:hAnsi="Arial"/>
+          <w:sz w:val="21"/>
+          <w:szCs w:val="21"/>
+        </w:rPr>
+        <w:t xml:space="preserve">Slack &amp; Teams Alerts - Push real-time alerts to Slack and Teams channels, and route events to the right people automatically.</w:t>
+      </w:r>
+    </w:p>
+    <w:p>
+      <w:pPr>
+        <w:pStyle w:val="ListParagraph"/>
+        <w:numPr>
+          <w:ilvl w:val="0"/>
+          <w:numId w:val="11"/>
+        </w:numPr>
+        <w:spacing w:after="60"/>
+      </w:pPr>
+      <w:r>
+        <w:rPr>
+          <w:rFonts w:ascii="Arial" w:cs="Arial" w:eastAsia="Arial" w:hAnsi="Arial"/>
+          <w:sz w:val="21"/>
+          <w:szCs w:val="21"/>
+        </w:rPr>
+        <w:t xml:space="preserve">Secure by Design - Share only what is required with strict access boundaries for vendors and external collaborators.</w:t>
       </w:r>
     </w:p>
     <w:p>
@@ -1979,7 +2258,7 @@
           <w:sz w:val="21"/>
           <w:szCs w:val="21"/>
         </w:rPr>
-        <w:t xml:space="preserve">In addition to software, we provide audit, remediation, training, and advisory services.</w:t>
+        <w:t xml:space="preserve">In addition to software, we provide audit, remediation, training, and advisory services to help teams plan, execute, and sustain accessibility outcomes, including our in-house Accessibility as a Service (A3S) program available at a3s.app.</w:t>
       </w:r>
     </w:p>
     <w:p>
@@ -2009,107 +2288,125 @@
         <w:pStyle w:val="ListParagraph"/>
         <w:numPr>
           <w:ilvl w:val="0"/>
-          <w:numId w:val="9"/>
-        </w:numPr>
-        <w:spacing w:after="60"/>
-      </w:pPr>
-      <w:r>
-        <w:rPr>
-          <w:rFonts w:ascii="Arial" w:cs="Arial" w:eastAsia="Arial" w:hAnsi="Arial"/>
-          <w:sz w:val="21"/>
-          <w:szCs w:val="21"/>
-        </w:rPr>
-        <w:t xml:space="preserve">Accessibility Audits - Baseline and recurring audits with manual + assistive technology testing</w:t>
-      </w:r>
-    </w:p>
-    <w:p>
-      <w:pPr>
-        <w:pStyle w:val="ListParagraph"/>
-        <w:numPr>
-          <w:ilvl w:val="0"/>
-          <w:numId w:val="9"/>
-        </w:numPr>
-        <w:spacing w:after="60"/>
-      </w:pPr>
-      <w:r>
-        <w:rPr>
-          <w:rFonts w:ascii="Arial" w:cs="Arial" w:eastAsia="Arial" w:hAnsi="Arial"/>
-          <w:sz w:val="21"/>
-          <w:szCs w:val="21"/>
-        </w:rPr>
-        <w:t xml:space="preserve">Remediation Delivery Support - Hands-on planning and execution support</w:t>
-      </w:r>
-    </w:p>
-    <w:p>
-      <w:pPr>
-        <w:pStyle w:val="ListParagraph"/>
-        <w:numPr>
-          <w:ilvl w:val="0"/>
-          <w:numId w:val="9"/>
-        </w:numPr>
-        <w:spacing w:after="60"/>
-      </w:pPr>
-      <w:r>
-        <w:rPr>
-          <w:rFonts w:ascii="Arial" w:cs="Arial" w:eastAsia="Arial" w:hAnsi="Arial"/>
-          <w:sz w:val="21"/>
-          <w:szCs w:val="21"/>
-        </w:rPr>
-        <w:t xml:space="preserve">Accessibility Training - Developer, QA, design, and content tracks</w:t>
-      </w:r>
-    </w:p>
-    <w:p>
-      <w:pPr>
-        <w:pStyle w:val="ListParagraph"/>
-        <w:numPr>
-          <w:ilvl w:val="0"/>
-          <w:numId w:val="9"/>
-        </w:numPr>
-        <w:spacing w:after="60"/>
-      </w:pPr>
-      <w:r>
-        <w:rPr>
-          <w:rFonts w:ascii="Arial" w:cs="Arial" w:eastAsia="Arial" w:hAnsi="Arial"/>
-          <w:sz w:val="21"/>
-          <w:szCs w:val="21"/>
-        </w:rPr>
-        <w:t xml:space="preserve">Document Remediation - PDFs, Word documents, spreadsheets, presentations</w:t>
-      </w:r>
-    </w:p>
-    <w:p>
-      <w:pPr>
-        <w:pStyle w:val="ListParagraph"/>
-        <w:numPr>
-          <w:ilvl w:val="0"/>
-          <w:numId w:val="9"/>
-        </w:numPr>
-        <w:spacing w:after="60"/>
-      </w:pPr>
-      <w:r>
-        <w:rPr>
-          <w:rFonts w:ascii="Arial" w:cs="Arial" w:eastAsia="Arial" w:hAnsi="Arial"/>
-          <w:sz w:val="21"/>
-          <w:szCs w:val="21"/>
-        </w:rPr>
-        <w:t xml:space="preserve">Program Governance Advisory - Policies, accountability models, compliance readiness</w:t>
-      </w:r>
-    </w:p>
-    <w:p>
-      <w:pPr>
-        <w:pStyle w:val="ListParagraph"/>
-        <w:numPr>
-          <w:ilvl w:val="0"/>
-          <w:numId w:val="9"/>
-        </w:numPr>
-        <w:spacing w:after="60"/>
-      </w:pPr>
-      <w:r>
-        <w:rPr>
-          <w:rFonts w:ascii="Arial" w:cs="Arial" w:eastAsia="Arial" w:hAnsi="Arial"/>
-          <w:sz w:val="21"/>
-          <w:szCs w:val="21"/>
-        </w:rPr>
-        <w:t xml:space="preserve">Validation and Verification - Regression testing and evidence packs</w:t>
+          <w:numId w:val="12"/>
+        </w:numPr>
+        <w:spacing w:after="60"/>
+      </w:pPr>
+      <w:r>
+        <w:rPr>
+          <w:rFonts w:ascii="Arial" w:cs="Arial" w:eastAsia="Arial" w:hAnsi="Arial"/>
+          <w:sz w:val="21"/>
+          <w:szCs w:val="21"/>
+        </w:rPr>
+        <w:t xml:space="preserve">Accessibility Audits - Baseline and recurring audits to identify barriers, compliance risk, and remediation scope.</w:t>
+      </w:r>
+    </w:p>
+    <w:p>
+      <w:pPr>
+        <w:pStyle w:val="ListParagraph"/>
+        <w:numPr>
+          <w:ilvl w:val="0"/>
+          <w:numId w:val="12"/>
+        </w:numPr>
+        <w:spacing w:after="60"/>
+      </w:pPr>
+      <w:r>
+        <w:rPr>
+          <w:rFonts w:ascii="Arial" w:cs="Arial" w:eastAsia="Arial" w:hAnsi="Arial"/>
+          <w:sz w:val="21"/>
+          <w:szCs w:val="21"/>
+        </w:rPr>
+        <w:t xml:space="preserve">Remediation Delivery Support - Hands-on remediation planning and execution support for product, engineering, and content teams.</w:t>
+      </w:r>
+    </w:p>
+    <w:p>
+      <w:pPr>
+        <w:pStyle w:val="ListParagraph"/>
+        <w:numPr>
+          <w:ilvl w:val="0"/>
+          <w:numId w:val="12"/>
+        </w:numPr>
+        <w:spacing w:after="60"/>
+      </w:pPr>
+      <w:r>
+        <w:rPr>
+          <w:rFonts w:ascii="Arial" w:cs="Arial" w:eastAsia="Arial" w:hAnsi="Arial"/>
+          <w:sz w:val="21"/>
+          <w:szCs w:val="21"/>
+        </w:rPr>
+        <w:t xml:space="preserve">Accessibility Training - Targeted training programs to build durable internal accessibility capability across teams.</w:t>
+      </w:r>
+    </w:p>
+    <w:p>
+      <w:pPr>
+        <w:pStyle w:val="ListParagraph"/>
+        <w:numPr>
+          <w:ilvl w:val="0"/>
+          <w:numId w:val="12"/>
+        </w:numPr>
+        <w:spacing w:after="60"/>
+      </w:pPr>
+      <w:r>
+        <w:rPr>
+          <w:rFonts w:ascii="Arial" w:cs="Arial" w:eastAsia="Arial" w:hAnsi="Arial"/>
+          <w:sz w:val="21"/>
+          <w:szCs w:val="21"/>
+        </w:rPr>
+        <w:t xml:space="preserve">Document Remediation - Make your PDFs, Word documents, spreadsheets, and presentations fully accessible and compliant with federal standards.</w:t>
+      </w:r>
+    </w:p>
+    <w:p>
+      <w:pPr>
+        <w:pStyle w:val="ListParagraph"/>
+        <w:numPr>
+          <w:ilvl w:val="0"/>
+          <w:numId w:val="12"/>
+        </w:numPr>
+        <w:spacing w:after="60"/>
+      </w:pPr>
+      <w:r>
+        <w:rPr>
+          <w:rFonts w:ascii="Arial" w:cs="Arial" w:eastAsia="Arial" w:hAnsi="Arial"/>
+          <w:sz w:val="21"/>
+          <w:szCs w:val="21"/>
+        </w:rPr>
+        <w:t xml:space="preserve">Program Governance Advisory - Operational guidance for policies, accountability models, and compliance readiness.</w:t>
+      </w:r>
+    </w:p>
+    <w:p>
+      <w:pPr>
+        <w:pStyle w:val="ListParagraph"/>
+        <w:numPr>
+          <w:ilvl w:val="0"/>
+          <w:numId w:val="12"/>
+        </w:numPr>
+        <w:spacing w:after="60"/>
+      </w:pPr>
+      <w:r>
+        <w:rPr>
+          <w:rFonts w:ascii="Arial" w:cs="Arial" w:eastAsia="Arial" w:hAnsi="Arial"/>
+          <w:sz w:val="21"/>
+          <w:szCs w:val="21"/>
+        </w:rPr>
+        <w:t xml:space="preserve">Validation and Verification - Independent verification to confirm fixes and measure conformance improvements over time.</w:t>
+      </w:r>
+    </w:p>
+    <w:p>
+      <w:pPr>
+        <w:pStyle w:val="ListParagraph"/>
+        <w:numPr>
+          <w:ilvl w:val="0"/>
+          <w:numId w:val="12"/>
+        </w:numPr>
+        <w:spacing w:after="60"/>
+      </w:pPr>
+      <w:r>
+        <w:rPr>
+          <w:rFonts w:ascii="Arial" w:cs="Arial" w:eastAsia="Arial" w:hAnsi="Arial"/>
+          <w:sz w:val="21"/>
+          <w:szCs w:val="21"/>
+        </w:rPr>
+        <w:t xml:space="preserve">Vendor and Team Enablement - Structured collaboration support for distributed teams and external vendors working on fixes.</w:t>
       </w:r>
     </w:p>
     <w:p>
@@ -2139,71 +2436,71 @@
         <w:pStyle w:val="ListParagraph"/>
         <w:numPr>
           <w:ilvl w:val="0"/>
-          <w:numId w:val="10"/>
-        </w:numPr>
-        <w:spacing w:after="60"/>
-      </w:pPr>
-      <w:r>
-        <w:rPr>
-          <w:rFonts w:ascii="Arial" w:cs="Arial" w:eastAsia="Arial" w:hAnsi="Arial"/>
-          <w:sz w:val="21"/>
-          <w:szCs w:val="21"/>
-        </w:rPr>
-        <w:t xml:space="preserve">Discovery and Scope</w:t>
-      </w:r>
-    </w:p>
-    <w:p>
-      <w:pPr>
-        <w:pStyle w:val="ListParagraph"/>
-        <w:numPr>
-          <w:ilvl w:val="0"/>
-          <w:numId w:val="10"/>
-        </w:numPr>
-        <w:spacing w:after="60"/>
-      </w:pPr>
-      <w:r>
-        <w:rPr>
-          <w:rFonts w:ascii="Arial" w:cs="Arial" w:eastAsia="Arial" w:hAnsi="Arial"/>
-          <w:sz w:val="21"/>
-          <w:szCs w:val="21"/>
-        </w:rPr>
-        <w:t xml:space="preserve">Assessment and Prioritization</w:t>
-      </w:r>
-    </w:p>
-    <w:p>
-      <w:pPr>
-        <w:pStyle w:val="ListParagraph"/>
-        <w:numPr>
-          <w:ilvl w:val="0"/>
-          <w:numId w:val="10"/>
-        </w:numPr>
-        <w:spacing w:after="60"/>
-      </w:pPr>
-      <w:r>
-        <w:rPr>
-          <w:rFonts w:ascii="Arial" w:cs="Arial" w:eastAsia="Arial" w:hAnsi="Arial"/>
-          <w:sz w:val="21"/>
-          <w:szCs w:val="21"/>
-        </w:rPr>
-        <w:t xml:space="preserve">Delivery and Enablement</w:t>
-      </w:r>
-    </w:p>
-    <w:p>
-      <w:pPr>
-        <w:pStyle w:val="ListParagraph"/>
-        <w:numPr>
-          <w:ilvl w:val="0"/>
-          <w:numId w:val="10"/>
-        </w:numPr>
-        <w:spacing w:after="60"/>
-      </w:pPr>
-      <w:r>
-        <w:rPr>
-          <w:rFonts w:ascii="Arial" w:cs="Arial" w:eastAsia="Arial" w:hAnsi="Arial"/>
-          <w:sz w:val="21"/>
-          <w:szCs w:val="21"/>
-        </w:rPr>
-        <w:t xml:space="preserve">Verification and Reporting</w:t>
+          <w:numId w:val="13"/>
+        </w:numPr>
+        <w:spacing w:after="60"/>
+      </w:pPr>
+      <w:r>
+        <w:rPr>
+          <w:rFonts w:ascii="Arial" w:cs="Arial" w:eastAsia="Arial" w:hAnsi="Arial"/>
+          <w:sz w:val="21"/>
+          <w:szCs w:val="21"/>
+        </w:rPr>
+        <w:t xml:space="preserve">Discovery and Scope - We assess goals, risk profile, properties in scope, and required outcomes for the engagement.</w:t>
+      </w:r>
+    </w:p>
+    <w:p>
+      <w:pPr>
+        <w:pStyle w:val="ListParagraph"/>
+        <w:numPr>
+          <w:ilvl w:val="0"/>
+          <w:numId w:val="13"/>
+        </w:numPr>
+        <w:spacing w:after="60"/>
+      </w:pPr>
+      <w:r>
+        <w:rPr>
+          <w:rFonts w:ascii="Arial" w:cs="Arial" w:eastAsia="Arial" w:hAnsi="Arial"/>
+          <w:sz w:val="21"/>
+          <w:szCs w:val="21"/>
+        </w:rPr>
+        <w:t xml:space="preserve">Assessment and Prioritization - Findings are grouped by severity, user impact, and implementation complexity to create execution clarity.</w:t>
+      </w:r>
+    </w:p>
+    <w:p>
+      <w:pPr>
+        <w:pStyle w:val="ListParagraph"/>
+        <w:numPr>
+          <w:ilvl w:val="0"/>
+          <w:numId w:val="13"/>
+        </w:numPr>
+        <w:spacing w:after="60"/>
+      </w:pPr>
+      <w:r>
+        <w:rPr>
+          <w:rFonts w:ascii="Arial" w:cs="Arial" w:eastAsia="Arial" w:hAnsi="Arial"/>
+          <w:sz w:val="21"/>
+          <w:szCs w:val="21"/>
+        </w:rPr>
+        <w:t xml:space="preserve">Delivery and Enablement - We work directly with your teams to implement fixes, train owners, and remove bottlenecks.</w:t>
+      </w:r>
+    </w:p>
+    <w:p>
+      <w:pPr>
+        <w:pStyle w:val="ListParagraph"/>
+        <w:numPr>
+          <w:ilvl w:val="0"/>
+          <w:numId w:val="13"/>
+        </w:numPr>
+        <w:spacing w:after="60"/>
+      </w:pPr>
+      <w:r>
+        <w:rPr>
+          <w:rFonts w:ascii="Arial" w:cs="Arial" w:eastAsia="Arial" w:hAnsi="Arial"/>
+          <w:sz w:val="21"/>
+          <w:szCs w:val="21"/>
+        </w:rPr>
+        <w:t xml:space="preserve">Verification and Reporting - Completed work is re-validated and reported with evidence that supports internal and external stakeholders.</w:t>
       </w:r>
     </w:p>
     <w:p>
@@ -2233,71 +2530,71 @@
         <w:pStyle w:val="ListParagraph"/>
         <w:numPr>
           <w:ilvl w:val="0"/>
-          <w:numId w:val="11"/>
-        </w:numPr>
-        <w:spacing w:after="60"/>
-      </w:pPr>
-      <w:r>
-        <w:rPr>
-          <w:rFonts w:ascii="Arial" w:cs="Arial" w:eastAsia="Arial" w:hAnsi="Arial"/>
-          <w:sz w:val="21"/>
-          <w:szCs w:val="21"/>
-        </w:rPr>
-        <w:t xml:space="preserve">Audit-Only</w:t>
-      </w:r>
-    </w:p>
-    <w:p>
-      <w:pPr>
-        <w:pStyle w:val="ListParagraph"/>
-        <w:numPr>
-          <w:ilvl w:val="0"/>
-          <w:numId w:val="11"/>
-        </w:numPr>
-        <w:spacing w:after="60"/>
-      </w:pPr>
-      <w:r>
-        <w:rPr>
-          <w:rFonts w:ascii="Arial" w:cs="Arial" w:eastAsia="Arial" w:hAnsi="Arial"/>
-          <w:sz w:val="21"/>
-          <w:szCs w:val="21"/>
-        </w:rPr>
-        <w:t xml:space="preserve">Audit + Remediation</w:t>
-      </w:r>
-    </w:p>
-    <w:p>
-      <w:pPr>
-        <w:pStyle w:val="ListParagraph"/>
-        <w:numPr>
-          <w:ilvl w:val="0"/>
-          <w:numId w:val="11"/>
-        </w:numPr>
-        <w:spacing w:after="60"/>
-      </w:pPr>
-      <w:r>
-        <w:rPr>
-          <w:rFonts w:ascii="Arial" w:cs="Arial" w:eastAsia="Arial" w:hAnsi="Arial"/>
-          <w:sz w:val="21"/>
-          <w:szCs w:val="21"/>
-        </w:rPr>
-        <w:t xml:space="preserve">Training + Governance</w:t>
-      </w:r>
-    </w:p>
-    <w:p>
-      <w:pPr>
-        <w:pStyle w:val="ListParagraph"/>
-        <w:numPr>
-          <w:ilvl w:val="0"/>
-          <w:numId w:val="11"/>
-        </w:numPr>
-        <w:spacing w:after="60"/>
-      </w:pPr>
-      <w:r>
-        <w:rPr>
-          <w:rFonts w:ascii="Arial" w:cs="Arial" w:eastAsia="Arial" w:hAnsi="Arial"/>
-          <w:sz w:val="21"/>
-          <w:szCs w:val="21"/>
-        </w:rPr>
-        <w:t xml:space="preserve">Full Program Partnership</w:t>
+          <w:numId w:val="14"/>
+        </w:numPr>
+        <w:spacing w:after="60"/>
+      </w:pPr>
+      <w:r>
+        <w:rPr>
+          <w:rFonts w:ascii="Arial" w:cs="Arial" w:eastAsia="Arial" w:hAnsi="Arial"/>
+          <w:sz w:val="21"/>
+          <w:szCs w:val="21"/>
+        </w:rPr>
+        <w:t xml:space="preserve">Audit-Only - For teams that need a clear baseline and prioritized backlog before implementation.</w:t>
+      </w:r>
+    </w:p>
+    <w:p>
+      <w:pPr>
+        <w:pStyle w:val="ListParagraph"/>
+        <w:numPr>
+          <w:ilvl w:val="0"/>
+          <w:numId w:val="14"/>
+        </w:numPr>
+        <w:spacing w:after="60"/>
+      </w:pPr>
+      <w:r>
+        <w:rPr>
+          <w:rFonts w:ascii="Arial" w:cs="Arial" w:eastAsia="Arial" w:hAnsi="Arial"/>
+          <w:sz w:val="21"/>
+          <w:szCs w:val="21"/>
+        </w:rPr>
+        <w:t xml:space="preserve">Audit + Remediation - For teams that need both issue discovery and guided delivery through verified closure.</w:t>
+      </w:r>
+    </w:p>
+    <w:p>
+      <w:pPr>
+        <w:pStyle w:val="ListParagraph"/>
+        <w:numPr>
+          <w:ilvl w:val="0"/>
+          <w:numId w:val="14"/>
+        </w:numPr>
+        <w:spacing w:after="60"/>
+      </w:pPr>
+      <w:r>
+        <w:rPr>
+          <w:rFonts w:ascii="Arial" w:cs="Arial" w:eastAsia="Arial" w:hAnsi="Arial"/>
+          <w:sz w:val="21"/>
+          <w:szCs w:val="21"/>
+        </w:rPr>
+        <w:t xml:space="preserve">Training + Governance - For organizations building long-term internal accessibility maturity and accountability.</w:t>
+      </w:r>
+    </w:p>
+    <w:p>
+      <w:pPr>
+        <w:pStyle w:val="ListParagraph"/>
+        <w:numPr>
+          <w:ilvl w:val="0"/>
+          <w:numId w:val="14"/>
+        </w:numPr>
+        <w:spacing w:after="60"/>
+      </w:pPr>
+      <w:r>
+        <w:rPr>
+          <w:rFonts w:ascii="Arial" w:cs="Arial" w:eastAsia="Arial" w:hAnsi="Arial"/>
+          <w:sz w:val="21"/>
+          <w:szCs w:val="21"/>
+        </w:rPr>
+        <w:t xml:space="preserve">Full Program Partnership - For enterprise programs requiring ongoing audit, remediation oversight, and executive reporting.</w:t>
       </w:r>
     </w:p>
     <w:p>
@@ -2395,197 +2692,197 @@
         <w:pStyle w:val="ListParagraph"/>
         <w:numPr>
           <w:ilvl w:val="0"/>
-          <w:numId w:val="12"/>
-        </w:numPr>
-        <w:spacing w:after="60"/>
-      </w:pPr>
-      <w:r>
-        <w:rPr>
-          <w:rFonts w:ascii="Arial" w:cs="Arial" w:eastAsia="Arial" w:hAnsi="Arial"/>
-          <w:sz w:val="21"/>
-          <w:szCs w:val="21"/>
-        </w:rPr>
-        <w:t xml:space="preserve">Clark County SD (Cobb County)</w:t>
-      </w:r>
-    </w:p>
-    <w:p>
-      <w:pPr>
-        <w:pStyle w:val="ListParagraph"/>
-        <w:numPr>
-          <w:ilvl w:val="0"/>
-          <w:numId w:val="12"/>
-        </w:numPr>
-        <w:spacing w:after="60"/>
-      </w:pPr>
-      <w:r>
-        <w:rPr>
-          <w:rFonts w:ascii="Arial" w:cs="Arial" w:eastAsia="Arial" w:hAnsi="Arial"/>
-          <w:sz w:val="21"/>
-          <w:szCs w:val="21"/>
-        </w:rPr>
-        <w:t xml:space="preserve">Cobb County, GA Technology Products, Solutions and Related Services - OMNIA Partners, Public Sector</w:t>
-      </w:r>
-    </w:p>
-    <w:p>
-      <w:pPr>
-        <w:pStyle w:val="ListParagraph"/>
-        <w:numPr>
-          <w:ilvl w:val="0"/>
-          <w:numId w:val="12"/>
-        </w:numPr>
-        <w:spacing w:after="60"/>
-      </w:pPr>
-      <w:r>
-        <w:rPr>
-          <w:rFonts w:ascii="Arial" w:cs="Arial" w:eastAsia="Arial" w:hAnsi="Arial"/>
-          <w:sz w:val="21"/>
-          <w:szCs w:val="21"/>
-        </w:rPr>
-        <w:t xml:space="preserve">Dallas ISD (Region 4)</w:t>
-      </w:r>
-    </w:p>
-    <w:p>
-      <w:pPr>
-        <w:pStyle w:val="ListParagraph"/>
-        <w:numPr>
-          <w:ilvl w:val="0"/>
-          <w:numId w:val="12"/>
-        </w:numPr>
-        <w:spacing w:after="60"/>
-      </w:pPr>
-      <w:r>
-        <w:rPr>
-          <w:rFonts w:ascii="Arial" w:cs="Arial" w:eastAsia="Arial" w:hAnsi="Arial"/>
-          <w:sz w:val="21"/>
-          <w:szCs w:val="21"/>
-        </w:rPr>
-        <w:t xml:space="preserve">Fairfax County (Cobb County)</w:t>
-      </w:r>
-    </w:p>
-    <w:p>
-      <w:pPr>
-        <w:pStyle w:val="ListParagraph"/>
-        <w:numPr>
-          <w:ilvl w:val="0"/>
-          <w:numId w:val="12"/>
-        </w:numPr>
-        <w:spacing w:after="60"/>
-      </w:pPr>
-      <w:r>
-        <w:rPr>
-          <w:rFonts w:ascii="Arial" w:cs="Arial" w:eastAsia="Arial" w:hAnsi="Arial"/>
-          <w:sz w:val="21"/>
-          <w:szCs w:val="21"/>
-        </w:rPr>
-        <w:t xml:space="preserve">Frisco ISD (Cobb County)</w:t>
-      </w:r>
-    </w:p>
-    <w:p>
-      <w:pPr>
-        <w:pStyle w:val="ListParagraph"/>
-        <w:numPr>
-          <w:ilvl w:val="0"/>
-          <w:numId w:val="12"/>
-        </w:numPr>
-        <w:spacing w:after="60"/>
-      </w:pPr>
-      <w:r>
-        <w:rPr>
-          <w:rFonts w:ascii="Arial" w:cs="Arial" w:eastAsia="Arial" w:hAnsi="Arial"/>
-          <w:sz w:val="21"/>
-          <w:szCs w:val="21"/>
-        </w:rPr>
-        <w:t xml:space="preserve">NASPO ValuePoint</w:t>
-      </w:r>
-    </w:p>
-    <w:p>
-      <w:pPr>
-        <w:pStyle w:val="ListParagraph"/>
-        <w:numPr>
-          <w:ilvl w:val="0"/>
-          <w:numId w:val="12"/>
-        </w:numPr>
-        <w:spacing w:after="60"/>
-      </w:pPr>
-      <w:r>
-        <w:rPr>
-          <w:rFonts w:ascii="Arial" w:cs="Arial" w:eastAsia="Arial" w:hAnsi="Arial"/>
-          <w:sz w:val="21"/>
-          <w:szCs w:val="21"/>
-        </w:rPr>
-        <w:t xml:space="preserve">RCA - Orange County - Region 4</w:t>
-      </w:r>
-    </w:p>
-    <w:p>
-      <w:pPr>
-        <w:pStyle w:val="ListParagraph"/>
-        <w:numPr>
-          <w:ilvl w:val="0"/>
-          <w:numId w:val="12"/>
-        </w:numPr>
-        <w:spacing w:after="60"/>
-      </w:pPr>
-      <w:r>
-        <w:rPr>
-          <w:rFonts w:ascii="Arial" w:cs="Arial" w:eastAsia="Arial" w:hAnsi="Arial"/>
-          <w:sz w:val="21"/>
-          <w:szCs w:val="21"/>
-        </w:rPr>
-        <w:t xml:space="preserve">Richardson ISD (Region 4)</w:t>
-      </w:r>
-    </w:p>
-    <w:p>
-      <w:pPr>
-        <w:pStyle w:val="ListParagraph"/>
-        <w:numPr>
-          <w:ilvl w:val="0"/>
-          <w:numId w:val="12"/>
-        </w:numPr>
-        <w:spacing w:after="60"/>
-      </w:pPr>
-      <w:r>
-        <w:rPr>
-          <w:rFonts w:ascii="Arial" w:cs="Arial" w:eastAsia="Arial" w:hAnsi="Arial"/>
-          <w:sz w:val="21"/>
-          <w:szCs w:val="21"/>
-        </w:rPr>
-        <w:t xml:space="preserve">Software Solutions and Services - OMNIA Partners, Public Sector</w:t>
-      </w:r>
-    </w:p>
-    <w:p>
-      <w:pPr>
-        <w:pStyle w:val="ListParagraph"/>
-        <w:numPr>
-          <w:ilvl w:val="0"/>
-          <w:numId w:val="12"/>
-        </w:numPr>
-        <w:spacing w:after="60"/>
-      </w:pPr>
-      <w:r>
-        <w:rPr>
-          <w:rFonts w:ascii="Arial" w:cs="Arial" w:eastAsia="Arial" w:hAnsi="Arial"/>
-          <w:sz w:val="21"/>
-          <w:szCs w:val="21"/>
-        </w:rPr>
-        <w:t xml:space="preserve">State of Florida (Cobb County)</w:t>
-      </w:r>
-    </w:p>
-    <w:p>
-      <w:pPr>
-        <w:pStyle w:val="ListParagraph"/>
-        <w:numPr>
-          <w:ilvl w:val="0"/>
-          <w:numId w:val="12"/>
-        </w:numPr>
-        <w:spacing w:after="60"/>
-      </w:pPr>
-      <w:r>
-        <w:rPr>
-          <w:rFonts w:ascii="Arial" w:cs="Arial" w:eastAsia="Arial" w:hAnsi="Arial"/>
-          <w:sz w:val="21"/>
-          <w:szCs w:val="21"/>
-        </w:rPr>
-        <w:t xml:space="preserve">WSSC (Cobb County)</w:t>
+          <w:numId w:val="15"/>
+        </w:numPr>
+        <w:spacing w:after="60"/>
+      </w:pPr>
+      <w:r>
+        <w:rPr>
+          <w:rFonts w:ascii="Arial" w:cs="Arial" w:eastAsia="Arial" w:hAnsi="Arial"/>
+          <w:sz w:val="21"/>
+          <w:szCs w:val="21"/>
+        </w:rPr>
+        <w:t xml:space="preserve">Clark County SD (Cobb County) - PUR-F0024 (Apr 15, 2025 - Apr 15, 2026)</w:t>
+      </w:r>
+    </w:p>
+    <w:p>
+      <w:pPr>
+        <w:pStyle w:val="ListParagraph"/>
+        <w:numPr>
+          <w:ilvl w:val="0"/>
+          <w:numId w:val="15"/>
+        </w:numPr>
+        <w:spacing w:after="60"/>
+      </w:pPr>
+      <w:r>
+        <w:rPr>
+          <w:rFonts w:ascii="Arial" w:cs="Arial" w:eastAsia="Arial" w:hAnsi="Arial"/>
+          <w:sz w:val="21"/>
+          <w:szCs w:val="21"/>
+        </w:rPr>
+        <w:t xml:space="preserve">Cobb County, GA Technology Products - OMNIA Partners - 23-6692-01 (May 01, 2023 - Apr 30, 2026)</w:t>
+      </w:r>
+    </w:p>
+    <w:p>
+      <w:pPr>
+        <w:pStyle w:val="ListParagraph"/>
+        <w:numPr>
+          <w:ilvl w:val="0"/>
+          <w:numId w:val="15"/>
+        </w:numPr>
+        <w:spacing w:after="60"/>
+      </w:pPr>
+      <w:r>
+        <w:rPr>
+          <w:rFonts w:ascii="Arial" w:cs="Arial" w:eastAsia="Arial" w:hAnsi="Arial"/>
+          <w:sz w:val="21"/>
+          <w:szCs w:val="21"/>
+        </w:rPr>
+        <w:t xml:space="preserve">Dallas ISD (Region 4) - 207331 (Feb 02, 2025 - Dec 31, 2027)</w:t>
+      </w:r>
+    </w:p>
+    <w:p>
+      <w:pPr>
+        <w:pStyle w:val="ListParagraph"/>
+        <w:numPr>
+          <w:ilvl w:val="0"/>
+          <w:numId w:val="15"/>
+        </w:numPr>
+        <w:spacing w:after="60"/>
+      </w:pPr>
+      <w:r>
+        <w:rPr>
+          <w:rFonts w:ascii="Arial" w:cs="Arial" w:eastAsia="Arial" w:hAnsi="Arial"/>
+          <w:sz w:val="21"/>
+          <w:szCs w:val="21"/>
+        </w:rPr>
+        <w:t xml:space="preserve">Fairfax County (Cobb County) - 4400012235 (Nov 15, 2023 - Apr 30, 2026)</w:t>
+      </w:r>
+    </w:p>
+    <w:p>
+      <w:pPr>
+        <w:pStyle w:val="ListParagraph"/>
+        <w:numPr>
+          <w:ilvl w:val="0"/>
+          <w:numId w:val="15"/>
+        </w:numPr>
+        <w:spacing w:after="60"/>
+      </w:pPr>
+      <w:r>
+        <w:rPr>
+          <w:rFonts w:ascii="Arial" w:cs="Arial" w:eastAsia="Arial" w:hAnsi="Arial"/>
+          <w:sz w:val="21"/>
+          <w:szCs w:val="21"/>
+        </w:rPr>
+        <w:t xml:space="preserve">Frisco ISD (Cobb County) - 23-6692-01 (Mar 10, 2025 - Apr 30, 2026)</w:t>
+      </w:r>
+    </w:p>
+    <w:p>
+      <w:pPr>
+        <w:pStyle w:val="ListParagraph"/>
+        <w:numPr>
+          <w:ilvl w:val="0"/>
+          <w:numId w:val="15"/>
+        </w:numPr>
+        <w:spacing w:after="60"/>
+      </w:pPr>
+      <w:r>
+        <w:rPr>
+          <w:rFonts w:ascii="Arial" w:cs="Arial" w:eastAsia="Arial" w:hAnsi="Arial"/>
+          <w:sz w:val="21"/>
+          <w:szCs w:val="21"/>
+        </w:rPr>
+        <w:t xml:space="preserve">NASPO ValuePoint - AR2472 (Oct 14, 2016 - Sep 15, 2026)</w:t>
+      </w:r>
+    </w:p>
+    <w:p>
+      <w:pPr>
+        <w:pStyle w:val="ListParagraph"/>
+        <w:numPr>
+          <w:ilvl w:val="0"/>
+          <w:numId w:val="15"/>
+        </w:numPr>
+        <w:spacing w:after="60"/>
+      </w:pPr>
+      <w:r>
+        <w:rPr>
+          <w:rFonts w:ascii="Arial" w:cs="Arial" w:eastAsia="Arial" w:hAnsi="Arial"/>
+          <w:sz w:val="21"/>
+          <w:szCs w:val="21"/>
+        </w:rPr>
+        <w:t xml:space="preserve">RCA - Orange County - Region 4 - RCA-017-25010020 (Jan 01, 2025 - Dec 31, 2027)</w:t>
+      </w:r>
+    </w:p>
+    <w:p>
+      <w:pPr>
+        <w:pStyle w:val="ListParagraph"/>
+        <w:numPr>
+          <w:ilvl w:val="0"/>
+          <w:numId w:val="15"/>
+        </w:numPr>
+        <w:spacing w:after="60"/>
+      </w:pPr>
+      <w:r>
+        <w:rPr>
+          <w:rFonts w:ascii="Arial" w:cs="Arial" w:eastAsia="Arial" w:hAnsi="Arial"/>
+          <w:sz w:val="21"/>
+          <w:szCs w:val="21"/>
+        </w:rPr>
+        <w:t xml:space="preserve">Richardson ISD (Region 4) - #R240303 (Sep 18, 2025 - Dec 31, 2027)</w:t>
+      </w:r>
+    </w:p>
+    <w:p>
+      <w:pPr>
+        <w:pStyle w:val="ListParagraph"/>
+        <w:numPr>
+          <w:ilvl w:val="0"/>
+          <w:numId w:val="15"/>
+        </w:numPr>
+        <w:spacing w:after="60"/>
+      </w:pPr>
+      <w:r>
+        <w:rPr>
+          <w:rFonts w:ascii="Arial" w:cs="Arial" w:eastAsia="Arial" w:hAnsi="Arial"/>
+          <w:sz w:val="21"/>
+          <w:szCs w:val="21"/>
+        </w:rPr>
+        <w:t xml:space="preserve">Software Solutions and Services - OMNIA Partners - R240303 (Jan 01, 2025 - Dec 31, 2027)</w:t>
+      </w:r>
+    </w:p>
+    <w:p>
+      <w:pPr>
+        <w:pStyle w:val="ListParagraph"/>
+        <w:numPr>
+          <w:ilvl w:val="0"/>
+          <w:numId w:val="15"/>
+        </w:numPr>
+        <w:spacing w:after="60"/>
+      </w:pPr>
+      <w:r>
+        <w:rPr>
+          <w:rFonts w:ascii="Arial" w:cs="Arial" w:eastAsia="Arial" w:hAnsi="Arial"/>
+          <w:sz w:val="21"/>
+          <w:szCs w:val="21"/>
+        </w:rPr>
+        <w:t xml:space="preserve">State of Florida (Cobb County) - 43210000-23-OMNIA-ACS (Feb 13, 2024 - Apr 30, 2026)</w:t>
+      </w:r>
+    </w:p>
+    <w:p>
+      <w:pPr>
+        <w:pStyle w:val="ListParagraph"/>
+        <w:numPr>
+          <w:ilvl w:val="0"/>
+          <w:numId w:val="15"/>
+        </w:numPr>
+        <w:spacing w:after="60"/>
+      </w:pPr>
+      <w:r>
+        <w:rPr>
+          <w:rFonts w:ascii="Arial" w:cs="Arial" w:eastAsia="Arial" w:hAnsi="Arial"/>
+          <w:sz w:val="21"/>
+          <w:szCs w:val="21"/>
+        </w:rPr>
+        <w:t xml:space="preserve">WSSC (Cobb County) - 48531 (Mar 05, 2025 - Apr 30, 2026)</w:t>
       </w:r>
     </w:p>
     <w:p>
@@ -2728,7 +3025,7 @@
           <w:sz w:val="22"/>
           <w:szCs w:val="22"/>
         </w:rPr>
-        <w:t xml:space="preserve">T. Holmes, IT Director - Kit Carson County, CO</w:t>
+        <w:t xml:space="preserve">T. Holmes, Information Technology Director - Kit Carson County, CO</w:t>
       </w:r>
     </w:p>
     <w:p>
@@ -2743,7 +3040,7 @@
           <w:sz w:val="21"/>
           <w:szCs w:val="21"/>
         </w:rPr>
-        <w:t xml:space="preserve">“The A3S program works like an extension of our team. They identify accessibility issues, fix them, retest, and monitor new releases. The monthly reports and expert support give us real confidence in compliance. We recommend Perspective Tester to any organization that needs a dependable accessibility system.”</w:t>
+        <w:t xml:space="preserve">“The A3S program works like an extension of our team. They identify accessibility issues, fix them, retest, and monitor new releases. The monthly reports and expert support give us real confidence in compliance.”</w:t>
       </w:r>
     </w:p>
     <w:p>
@@ -2780,7 +3077,7 @@
           <w:sz w:val="21"/>
           <w:szCs w:val="21"/>
         </w:rPr>
-        <w:t xml:space="preserve">“I would definitely recommend Perspective Tester to other government agencies, nonprofits, and corporations trying to make their website accessible and/or compliant with digital accessibility laws. They make me feel confident that our website will be accessible to all our residents and we have protection from potential lawsuits.”</w:t>
+        <w:t xml:space="preserve">“I would definitely recommend Perspective Tester to other government agencies, nonprofits, and corporations. They make me feel confident that our website will be accessible to all our residents and we have protection from potential lawsuits.”</w:t>
       </w:r>
     </w:p>
     <w:p>
@@ -2802,7 +3099,7 @@
           <w:sz w:val="22"/>
           <w:szCs w:val="22"/>
         </w:rPr>
-        <w:t xml:space="preserve">J. Stanley, Communications Manager - El Paso County, CO</w:t>
+        <w:t xml:space="preserve">J. Stanley, Communications and Public Relations Manager - El Paso County, CO, Public Health</w:t>
       </w:r>
     </w:p>
     <w:p>
@@ -3047,71 +3344,71 @@
         <w:pStyle w:val="ListParagraph"/>
         <w:numPr>
           <w:ilvl w:val="0"/>
-          <w:numId w:val="13"/>
-        </w:numPr>
-        <w:spacing w:after="60"/>
-      </w:pPr>
-      <w:r>
-        <w:rPr>
-          <w:rFonts w:ascii="Arial" w:cs="Arial" w:eastAsia="Arial" w:hAnsi="Arial"/>
-          <w:sz w:val="21"/>
-          <w:szCs w:val="21"/>
-        </w:rPr>
-        <w:t xml:space="preserve">Accessibility for Everyone - Build for the 2 billion people around the world who need support</w:t>
-      </w:r>
-    </w:p>
-    <w:p>
-      <w:pPr>
-        <w:pStyle w:val="ListParagraph"/>
-        <w:numPr>
-          <w:ilvl w:val="0"/>
-          <w:numId w:val="13"/>
-        </w:numPr>
-        <w:spacing w:after="60"/>
-      </w:pPr>
-      <w:r>
-        <w:rPr>
-          <w:rFonts w:ascii="Arial" w:cs="Arial" w:eastAsia="Arial" w:hAnsi="Arial"/>
-          <w:sz w:val="21"/>
-          <w:szCs w:val="21"/>
-        </w:rPr>
-        <w:t xml:space="preserve">Real-User Testing - Native assistive technology users test against real-world usage patterns</w:t>
-      </w:r>
-    </w:p>
-    <w:p>
-      <w:pPr>
-        <w:pStyle w:val="ListParagraph"/>
-        <w:numPr>
-          <w:ilvl w:val="0"/>
-          <w:numId w:val="13"/>
-        </w:numPr>
-        <w:spacing w:after="60"/>
-      </w:pPr>
-      <w:r>
-        <w:rPr>
-          <w:rFonts w:ascii="Arial" w:cs="Arial" w:eastAsia="Arial" w:hAnsi="Arial"/>
-          <w:sz w:val="21"/>
-          <w:szCs w:val="21"/>
-        </w:rPr>
-        <w:t xml:space="preserve">WCAG 2.2 AA Standards - Manual testing with IAAP-certified professionals</w:t>
-      </w:r>
-    </w:p>
-    <w:p>
-      <w:pPr>
-        <w:pStyle w:val="ListParagraph"/>
-        <w:numPr>
-          <w:ilvl w:val="0"/>
-          <w:numId w:val="13"/>
-        </w:numPr>
-        <w:spacing w:after="60"/>
-      </w:pPr>
-      <w:r>
-        <w:rPr>
-          <w:rFonts w:ascii="Arial" w:cs="Arial" w:eastAsia="Arial" w:hAnsi="Arial"/>
-          <w:sz w:val="21"/>
-          <w:szCs w:val="21"/>
-        </w:rPr>
-        <w:t xml:space="preserve">Building for the Real User - Relationships with accessibility attorneys and advocacy groups</w:t>
+          <w:numId w:val="16"/>
+        </w:numPr>
+        <w:spacing w:after="60"/>
+      </w:pPr>
+      <w:r>
+        <w:rPr>
+          <w:rFonts w:ascii="Arial" w:cs="Arial" w:eastAsia="Arial" w:hAnsi="Arial"/>
+          <w:sz w:val="21"/>
+          <w:szCs w:val="21"/>
+        </w:rPr>
+        <w:t xml:space="preserve">Accessibility for Everyone - We build for the 2 billion people around the world who need some level of support when accessing the web.</w:t>
+      </w:r>
+    </w:p>
+    <w:p>
+      <w:pPr>
+        <w:pStyle w:val="ListParagraph"/>
+        <w:numPr>
+          <w:ilvl w:val="0"/>
+          <w:numId w:val="16"/>
+        </w:numPr>
+        <w:spacing w:after="60"/>
+      </w:pPr>
+      <w:r>
+        <w:rPr>
+          <w:rFonts w:ascii="Arial" w:cs="Arial" w:eastAsia="Arial" w:hAnsi="Arial"/>
+          <w:sz w:val="21"/>
+          <w:szCs w:val="21"/>
+        </w:rPr>
+        <w:t xml:space="preserve">Real-User Testing - Our team includes native assistive technology users who test against real-world usage patterns, not just automated checklists.</w:t>
+      </w:r>
+    </w:p>
+    <w:p>
+      <w:pPr>
+        <w:pStyle w:val="ListParagraph"/>
+        <w:numPr>
+          <w:ilvl w:val="0"/>
+          <w:numId w:val="16"/>
+        </w:numPr>
+        <w:spacing w:after="60"/>
+      </w:pPr>
+      <w:r>
+        <w:rPr>
+          <w:rFonts w:ascii="Arial" w:cs="Arial" w:eastAsia="Arial" w:hAnsi="Arial"/>
+          <w:sz w:val="21"/>
+          <w:szCs w:val="21"/>
+        </w:rPr>
+        <w:t xml:space="preserve">WCAG 2.2 AA Standards - We test against WCAG 2.2 AA standards with manual testing as our primary approach, backed by IAAP-certified professionals.</w:t>
+      </w:r>
+    </w:p>
+    <w:p>
+      <w:pPr>
+        <w:pStyle w:val="ListParagraph"/>
+        <w:numPr>
+          <w:ilvl w:val="0"/>
+          <w:numId w:val="16"/>
+        </w:numPr>
+        <w:spacing w:after="60"/>
+      </w:pPr>
+      <w:r>
+        <w:rPr>
+          <w:rFonts w:ascii="Arial" w:cs="Arial" w:eastAsia="Arial" w:hAnsi="Arial"/>
+          <w:sz w:val="21"/>
+          <w:szCs w:val="21"/>
+        </w:rPr>
+        <w:t xml:space="preserve">Building for the Real User - We focus on building the web for real disabled users, maintaining relationships with accessibility attorneys and advocacy groups.</w:t>
       </w:r>
     </w:p>
     <w:p>
@@ -3157,7 +3454,7 @@
           <w:sz w:val="26"/>
           <w:szCs w:val="26"/>
         </w:rPr>
-        <w:t xml:space="preserve">Connect with an Accessibility Specialist</w:t>
+        <w:t xml:space="preserve">Schedule a Demo</w:t>
       </w:r>
     </w:p>
     <w:p>
@@ -3170,7 +3467,7 @@
           <w:sz w:val="21"/>
           <w:szCs w:val="21"/>
         </w:rPr>
-        <w:t xml:space="preserve">Whether you need a full-site accessibility audit, ongoing compliance monitoring, or help building an accessibility operations program, our IAAP-certified specialists are ready to help. Connect with a Perspective Tester expert to discover how your organization can achieve and maintain digital accessibility compliance.</w:t>
+        <w:t xml:space="preserve">Ready to see how Perspective Tester can transform your organization’s digital accessibility? Schedule a personalized demo of our A3S (Accessibility as a Service) platform or P15R (Accessibility Ops Platform) and discover how we help government agencies and enterprises achieve full WCAG 2.2 compliance. Our accessibility experts will walk you through a tailored demonstration based on your specific needs.</w:t>
       </w:r>
     </w:p>
     <w:p>
@@ -3199,7 +3496,7 @@
         <w:pStyle w:val="ListParagraph"/>
         <w:numPr>
           <w:ilvl w:val="0"/>
-          <w:numId w:val="14"/>
+          <w:numId w:val="17"/>
         </w:numPr>
         <w:spacing w:after="60"/>
       </w:pPr>
@@ -3217,7 +3514,7 @@
         <w:pStyle w:val="ListParagraph"/>
         <w:numPr>
           <w:ilvl w:val="0"/>
-          <w:numId w:val="14"/>
+          <w:numId w:val="17"/>
         </w:numPr>
         <w:spacing w:after="60"/>
       </w:pPr>
@@ -3235,7 +3532,7 @@
         <w:pStyle w:val="ListParagraph"/>
         <w:numPr>
           <w:ilvl w:val="0"/>
-          <w:numId w:val="14"/>
+          <w:numId w:val="17"/>
         </w:numPr>
         <w:spacing w:after="60"/>
       </w:pPr>
@@ -3253,7 +3550,7 @@
         <w:pStyle w:val="ListParagraph"/>
         <w:numPr>
           <w:ilvl w:val="0"/>
-          <w:numId w:val="14"/>
+          <w:numId w:val="17"/>
         </w:numPr>
         <w:spacing w:after="60"/>
       </w:pPr>
@@ -3271,7 +3568,7 @@
         <w:pStyle w:val="ListParagraph"/>
         <w:numPr>
           <w:ilvl w:val="0"/>
-          <w:numId w:val="14"/>
+          <w:numId w:val="17"/>
         </w:numPr>
         <w:spacing w:after="60"/>
       </w:pPr>
@@ -3289,7 +3586,7 @@
         <w:pStyle w:val="ListParagraph"/>
         <w:numPr>
           <w:ilvl w:val="0"/>
-          <w:numId w:val="14"/>
+          <w:numId w:val="17"/>
         </w:numPr>
         <w:spacing w:after="60"/>
       </w:pPr>
@@ -3307,25 +3604,25 @@
         <w:pStyle w:val="ListParagraph"/>
         <w:numPr>
           <w:ilvl w:val="0"/>
-          <w:numId w:val="14"/>
-        </w:numPr>
-        <w:spacing w:after="60"/>
-      </w:pPr>
-      <w:r>
-        <w:rPr>
-          <w:rFonts w:ascii="Arial" w:cs="Arial" w:eastAsia="Arial" w:hAnsi="Arial"/>
-          <w:sz w:val="21"/>
-          <w:szCs w:val="21"/>
-        </w:rPr>
-        <w:t xml:space="preserve">Product Interest (required) - A3S, P15R, Both, Services Only, Other</w:t>
-      </w:r>
-    </w:p>
-    <w:p>
-      <w:pPr>
-        <w:pStyle w:val="ListParagraph"/>
-        <w:numPr>
-          <w:ilvl w:val="0"/>
-          <w:numId w:val="14"/>
+          <w:numId w:val="17"/>
+        </w:numPr>
+        <w:spacing w:after="60"/>
+      </w:pPr>
+      <w:r>
+        <w:rPr>
+          <w:rFonts w:ascii="Arial" w:cs="Arial" w:eastAsia="Arial" w:hAnsi="Arial"/>
+          <w:sz w:val="21"/>
+          <w:szCs w:val="21"/>
+        </w:rPr>
+        <w:t xml:space="preserve">Product Interest (required) - A3S, P15R, Both A3S and P15R, Services Only, Other / Not Sure</w:t>
+      </w:r>
+    </w:p>
+    <w:p>
+      <w:pPr>
+        <w:pStyle w:val="ListParagraph"/>
+        <w:numPr>
+          <w:ilvl w:val="0"/>
+          <w:numId w:val="17"/>
         </w:numPr>
         <w:spacing w:after="60"/>
       </w:pPr>
@@ -3486,7 +3783,7 @@
         <w:pStyle w:val="ListParagraph"/>
         <w:numPr>
           <w:ilvl w:val="0"/>
-          <w:numId w:val="15"/>
+          <w:numId w:val="18"/>
         </w:numPr>
         <w:spacing w:after="60"/>
       </w:pPr>
@@ -3504,7 +3801,7 @@
         <w:pStyle w:val="ListParagraph"/>
         <w:numPr>
           <w:ilvl w:val="0"/>
-          <w:numId w:val="15"/>
+          <w:numId w:val="18"/>
         </w:numPr>
         <w:spacing w:after="60"/>
       </w:pPr>
@@ -3522,7 +3819,7 @@
         <w:pStyle w:val="ListParagraph"/>
         <w:numPr>
           <w:ilvl w:val="0"/>
-          <w:numId w:val="15"/>
+          <w:numId w:val="18"/>
         </w:numPr>
         <w:spacing w:after="60"/>
       </w:pPr>
@@ -3540,7 +3837,7 @@
         <w:pStyle w:val="ListParagraph"/>
         <w:numPr>
           <w:ilvl w:val="0"/>
-          <w:numId w:val="15"/>
+          <w:numId w:val="18"/>
         </w:numPr>
         <w:spacing w:after="60"/>
       </w:pPr>
@@ -3558,7 +3855,7 @@
         <w:pStyle w:val="ListParagraph"/>
         <w:numPr>
           <w:ilvl w:val="0"/>
-          <w:numId w:val="15"/>
+          <w:numId w:val="18"/>
         </w:numPr>
         <w:spacing w:after="60"/>
       </w:pPr>
@@ -3576,7 +3873,7 @@
         <w:pStyle w:val="ListParagraph"/>
         <w:numPr>
           <w:ilvl w:val="0"/>
-          <w:numId w:val="15"/>
+          <w:numId w:val="18"/>
         </w:numPr>
         <w:spacing w:after="60"/>
       </w:pPr>
@@ -3594,7 +3891,7 @@
         <w:pStyle w:val="ListParagraph"/>
         <w:numPr>
           <w:ilvl w:val="0"/>
-          <w:numId w:val="15"/>
+          <w:numId w:val="18"/>
         </w:numPr>
         <w:spacing w:after="60"/>
       </w:pPr>
@@ -3876,8 +4173,8 @@
     <w:multiLevelType w:val="hybridMultilevel"/>
     <w:lvl w:ilvl="0" w15:tentative="1">
       <w:start w:val="1"/>
-      <w:numFmt w:val="bullet"/>
-      <w:lvlText w:val="•"/>
+      <w:numFmt w:val="decimal"/>
+      <w:lvlText w:val="%1."/>
       <w:lvlJc w:val="left"/>
       <w:pPr>
         <w:ind w:left="720" w:hanging="360"/>
@@ -3900,8 +4197,8 @@
     <w:multiLevelType w:val="hybridMultilevel"/>
     <w:lvl w:ilvl="0" w15:tentative="1">
       <w:start w:val="1"/>
-      <w:numFmt w:val="bullet"/>
-      <w:lvlText w:val="•"/>
+      <w:numFmt w:val="decimal"/>
+      <w:lvlText w:val="%1."/>
       <w:lvlJc w:val="left"/>
       <w:pPr>
         <w:ind w:left="720" w:hanging="360"/>
@@ -3912,8 +4209,8 @@
     <w:multiLevelType w:val="hybridMultilevel"/>
     <w:lvl w:ilvl="0" w15:tentative="1">
       <w:start w:val="1"/>
-      <w:numFmt w:val="decimal"/>
-      <w:lvlText w:val="%1."/>
+      <w:numFmt w:val="bullet"/>
+      <w:lvlText w:val="•"/>
       <w:lvlJc w:val="left"/>
       <w:pPr>
         <w:ind w:left="720" w:hanging="360"/>
@@ -3924,8 +4221,8 @@
     <w:multiLevelType w:val="hybridMultilevel"/>
     <w:lvl w:ilvl="0" w15:tentative="1">
       <w:start w:val="1"/>
-      <w:numFmt w:val="bullet"/>
-      <w:lvlText w:val="•"/>
+      <w:numFmt w:val="decimal"/>
+      <w:lvlText w:val="%1."/>
       <w:lvlJc w:val="left"/>
       <w:pPr>
         <w:ind w:left="720" w:hanging="360"/>
@@ -3948,8 +4245,8 @@
     <w:multiLevelType w:val="hybridMultilevel"/>
     <w:lvl w:ilvl="0" w15:tentative="1">
       <w:start w:val="1"/>
-      <w:numFmt w:val="bullet"/>
-      <w:lvlText w:val="•"/>
+      <w:numFmt w:val="decimal"/>
+      <w:lvlText w:val="%1."/>
       <w:lvlJc w:val="left"/>
       <w:pPr>
         <w:ind w:left="720" w:hanging="360"/>
@@ -3960,8 +4257,8 @@
     <w:multiLevelType w:val="hybridMultilevel"/>
     <w:lvl w:ilvl="0" w15:tentative="1">
       <w:start w:val="1"/>
-      <w:numFmt w:val="decimal"/>
-      <w:lvlText w:val="%1."/>
+      <w:numFmt w:val="bullet"/>
+      <w:lvlText w:val="•"/>
       <w:lvlJc w:val="left"/>
       <w:pPr>
         <w:ind w:left="720" w:hanging="360"/>
@@ -3972,8 +4269,8 @@
     <w:multiLevelType w:val="hybridMultilevel"/>
     <w:lvl w:ilvl="0" w15:tentative="1">
       <w:start w:val="1"/>
-      <w:numFmt w:val="bullet"/>
-      <w:lvlText w:val="•"/>
+      <w:numFmt w:val="decimal"/>
+      <w:lvlText w:val="%1."/>
       <w:lvlJc w:val="left"/>
       <w:pPr>
         <w:ind w:left="720" w:hanging="360"/>
@@ -3984,8 +4281,8 @@
     <w:multiLevelType w:val="hybridMultilevel"/>
     <w:lvl w:ilvl="0" w15:tentative="1">
       <w:start w:val="1"/>
-      <w:numFmt w:val="decimal"/>
-      <w:lvlText w:val="%1."/>
+      <w:numFmt w:val="bullet"/>
+      <w:lvlText w:val="•"/>
       <w:lvlJc w:val="left"/>
       <w:pPr>
         <w:ind w:left="720" w:hanging="360"/>
@@ -4020,8 +4317,8 @@
     <w:multiLevelType w:val="hybridMultilevel"/>
     <w:lvl w:ilvl="0" w15:tentative="1">
       <w:start w:val="1"/>
-      <w:numFmt w:val="bullet"/>
-      <w:lvlText w:val="•"/>
+      <w:numFmt w:val="decimal"/>
+      <w:lvlText w:val="%1."/>
       <w:lvlJc w:val="left"/>
       <w:pPr>
         <w:ind w:left="720" w:hanging="360"/>
@@ -4044,8 +4341,8 @@
     <w:multiLevelType w:val="hybridMultilevel"/>
     <w:lvl w:ilvl="0" w15:tentative="1">
       <w:start w:val="1"/>
-      <w:numFmt w:val="bullet"/>
-      <w:lvlText w:val="•"/>
+      <w:numFmt w:val="decimal"/>
+      <w:lvlText w:val="%1."/>
       <w:lvlJc w:val="left"/>
       <w:pPr>
         <w:ind w:left="720" w:hanging="360"/>
@@ -4068,8 +4365,392 @@
     <w:multiLevelType w:val="hybridMultilevel"/>
     <w:lvl w:ilvl="0" w15:tentative="1">
       <w:start w:val="1"/>
+      <w:numFmt w:val="decimal"/>
+      <w:lvlText w:val="%1."/>
+      <w:lvlJc w:val="left"/>
+      <w:pPr>
+        <w:ind w:left="720" w:hanging="360"/>
+      </w:pPr>
+    </w:lvl>
+  </w:abstractNum>
+  <w:abstractNum w:abstractNumId="20" w15:restartNumberingAfterBreak="0">
+    <w:multiLevelType w:val="hybridMultilevel"/>
+    <w:lvl w:ilvl="0" w15:tentative="1">
+      <w:start w:val="1"/>
       <w:numFmt w:val="bullet"/>
       <w:lvlText w:val="•"/>
+      <w:lvlJc w:val="left"/>
+      <w:pPr>
+        <w:ind w:left="720" w:hanging="360"/>
+      </w:pPr>
+    </w:lvl>
+  </w:abstractNum>
+  <w:abstractNum w:abstractNumId="21" w15:restartNumberingAfterBreak="0">
+    <w:multiLevelType w:val="hybridMultilevel"/>
+    <w:lvl w:ilvl="0" w15:tentative="1">
+      <w:start w:val="1"/>
+      <w:numFmt w:val="decimal"/>
+      <w:lvlText w:val="%1."/>
+      <w:lvlJc w:val="left"/>
+      <w:pPr>
+        <w:ind w:left="720" w:hanging="360"/>
+      </w:pPr>
+    </w:lvl>
+  </w:abstractNum>
+  <w:abstractNum w:abstractNumId="22" w15:restartNumberingAfterBreak="0">
+    <w:multiLevelType w:val="hybridMultilevel"/>
+    <w:lvl w:ilvl="0" w15:tentative="1">
+      <w:start w:val="1"/>
+      <w:numFmt w:val="bullet"/>
+      <w:lvlText w:val="•"/>
+      <w:lvlJc w:val="left"/>
+      <w:pPr>
+        <w:ind w:left="720" w:hanging="360"/>
+      </w:pPr>
+    </w:lvl>
+  </w:abstractNum>
+  <w:abstractNum w:abstractNumId="23" w15:restartNumberingAfterBreak="0">
+    <w:multiLevelType w:val="hybridMultilevel"/>
+    <w:lvl w:ilvl="0" w15:tentative="1">
+      <w:start w:val="1"/>
+      <w:numFmt w:val="decimal"/>
+      <w:lvlText w:val="%1."/>
+      <w:lvlJc w:val="left"/>
+      <w:pPr>
+        <w:ind w:left="720" w:hanging="360"/>
+      </w:pPr>
+    </w:lvl>
+  </w:abstractNum>
+  <w:abstractNum w:abstractNumId="24" w15:restartNumberingAfterBreak="0">
+    <w:multiLevelType w:val="hybridMultilevel"/>
+    <w:lvl w:ilvl="0" w15:tentative="1">
+      <w:start w:val="1"/>
+      <w:numFmt w:val="bullet"/>
+      <w:lvlText w:val="•"/>
+      <w:lvlJc w:val="left"/>
+      <w:pPr>
+        <w:ind w:left="720" w:hanging="360"/>
+      </w:pPr>
+    </w:lvl>
+  </w:abstractNum>
+  <w:abstractNum w:abstractNumId="25" w15:restartNumberingAfterBreak="0">
+    <w:multiLevelType w:val="hybridMultilevel"/>
+    <w:lvl w:ilvl="0" w15:tentative="1">
+      <w:start w:val="1"/>
+      <w:numFmt w:val="decimal"/>
+      <w:lvlText w:val="%1."/>
+      <w:lvlJc w:val="left"/>
+      <w:pPr>
+        <w:ind w:left="720" w:hanging="360"/>
+      </w:pPr>
+    </w:lvl>
+  </w:abstractNum>
+  <w:abstractNum w:abstractNumId="26" w15:restartNumberingAfterBreak="0">
+    <w:multiLevelType w:val="hybridMultilevel"/>
+    <w:lvl w:ilvl="0" w15:tentative="1">
+      <w:start w:val="1"/>
+      <w:numFmt w:val="bullet"/>
+      <w:lvlText w:val="•"/>
+      <w:lvlJc w:val="left"/>
+      <w:pPr>
+        <w:ind w:left="720" w:hanging="360"/>
+      </w:pPr>
+    </w:lvl>
+  </w:abstractNum>
+  <w:abstractNum w:abstractNumId="27" w15:restartNumberingAfterBreak="0">
+    <w:multiLevelType w:val="hybridMultilevel"/>
+    <w:lvl w:ilvl="0" w15:tentative="1">
+      <w:start w:val="1"/>
+      <w:numFmt w:val="decimal"/>
+      <w:lvlText w:val="%1."/>
+      <w:lvlJc w:val="left"/>
+      <w:pPr>
+        <w:ind w:left="720" w:hanging="360"/>
+      </w:pPr>
+    </w:lvl>
+  </w:abstractNum>
+  <w:abstractNum w:abstractNumId="28" w15:restartNumberingAfterBreak="0">
+    <w:multiLevelType w:val="hybridMultilevel"/>
+    <w:lvl w:ilvl="0" w15:tentative="1">
+      <w:start w:val="1"/>
+      <w:numFmt w:val="bullet"/>
+      <w:lvlText w:val="•"/>
+      <w:lvlJc w:val="left"/>
+      <w:pPr>
+        <w:ind w:left="720" w:hanging="360"/>
+      </w:pPr>
+    </w:lvl>
+  </w:abstractNum>
+  <w:abstractNum w:abstractNumId="29" w15:restartNumberingAfterBreak="0">
+    <w:multiLevelType w:val="hybridMultilevel"/>
+    <w:lvl w:ilvl="0" w15:tentative="1">
+      <w:start w:val="1"/>
+      <w:numFmt w:val="decimal"/>
+      <w:lvlText w:val="%1."/>
+      <w:lvlJc w:val="left"/>
+      <w:pPr>
+        <w:ind w:left="720" w:hanging="360"/>
+      </w:pPr>
+    </w:lvl>
+  </w:abstractNum>
+  <w:abstractNum w:abstractNumId="30" w15:restartNumberingAfterBreak="0">
+    <w:multiLevelType w:val="hybridMultilevel"/>
+    <w:lvl w:ilvl="0" w15:tentative="1">
+      <w:start w:val="1"/>
+      <w:numFmt w:val="bullet"/>
+      <w:lvlText w:val="•"/>
+      <w:lvlJc w:val="left"/>
+      <w:pPr>
+        <w:ind w:left="720" w:hanging="360"/>
+      </w:pPr>
+    </w:lvl>
+  </w:abstractNum>
+  <w:abstractNum w:abstractNumId="31" w15:restartNumberingAfterBreak="0">
+    <w:multiLevelType w:val="hybridMultilevel"/>
+    <w:lvl w:ilvl="0" w15:tentative="1">
+      <w:start w:val="1"/>
+      <w:numFmt w:val="decimal"/>
+      <w:lvlText w:val="%1."/>
+      <w:lvlJc w:val="left"/>
+      <w:pPr>
+        <w:ind w:left="720" w:hanging="360"/>
+      </w:pPr>
+    </w:lvl>
+  </w:abstractNum>
+  <w:abstractNum w:abstractNumId="32" w15:restartNumberingAfterBreak="0">
+    <w:multiLevelType w:val="hybridMultilevel"/>
+    <w:lvl w:ilvl="0" w15:tentative="1">
+      <w:start w:val="1"/>
+      <w:numFmt w:val="bullet"/>
+      <w:lvlText w:val="•"/>
+      <w:lvlJc w:val="left"/>
+      <w:pPr>
+        <w:ind w:left="720" w:hanging="360"/>
+      </w:pPr>
+    </w:lvl>
+  </w:abstractNum>
+  <w:abstractNum w:abstractNumId="33" w15:restartNumberingAfterBreak="0">
+    <w:multiLevelType w:val="hybridMultilevel"/>
+    <w:lvl w:ilvl="0" w15:tentative="1">
+      <w:start w:val="1"/>
+      <w:numFmt w:val="decimal"/>
+      <w:lvlText w:val="%1."/>
+      <w:lvlJc w:val="left"/>
+      <w:pPr>
+        <w:ind w:left="720" w:hanging="360"/>
+      </w:pPr>
+    </w:lvl>
+  </w:abstractNum>
+  <w:abstractNum w:abstractNumId="34" w15:restartNumberingAfterBreak="0">
+    <w:multiLevelType w:val="hybridMultilevel"/>
+    <w:lvl w:ilvl="0" w15:tentative="1">
+      <w:start w:val="1"/>
+      <w:numFmt w:val="bullet"/>
+      <w:lvlText w:val="•"/>
+      <w:lvlJc w:val="left"/>
+      <w:pPr>
+        <w:ind w:left="720" w:hanging="360"/>
+      </w:pPr>
+    </w:lvl>
+  </w:abstractNum>
+  <w:abstractNum w:abstractNumId="35" w15:restartNumberingAfterBreak="0">
+    <w:multiLevelType w:val="hybridMultilevel"/>
+    <w:lvl w:ilvl="0" w15:tentative="1">
+      <w:start w:val="1"/>
+      <w:numFmt w:val="decimal"/>
+      <w:lvlText w:val="%1."/>
+      <w:lvlJc w:val="left"/>
+      <w:pPr>
+        <w:ind w:left="720" w:hanging="360"/>
+      </w:pPr>
+    </w:lvl>
+  </w:abstractNum>
+  <w:abstractNum w:abstractNumId="36" w15:restartNumberingAfterBreak="0">
+    <w:multiLevelType w:val="hybridMultilevel"/>
+    <w:lvl w:ilvl="0" w15:tentative="1">
+      <w:start w:val="1"/>
+      <w:numFmt w:val="bullet"/>
+      <w:lvlText w:val="•"/>
+      <w:lvlJc w:val="left"/>
+      <w:pPr>
+        <w:ind w:left="720" w:hanging="360"/>
+      </w:pPr>
+    </w:lvl>
+  </w:abstractNum>
+  <w:abstractNum w:abstractNumId="37" w15:restartNumberingAfterBreak="0">
+    <w:multiLevelType w:val="hybridMultilevel"/>
+    <w:lvl w:ilvl="0" w15:tentative="1">
+      <w:start w:val="1"/>
+      <w:numFmt w:val="decimal"/>
+      <w:lvlText w:val="%1."/>
+      <w:lvlJc w:val="left"/>
+      <w:pPr>
+        <w:ind w:left="720" w:hanging="360"/>
+      </w:pPr>
+    </w:lvl>
+  </w:abstractNum>
+  <w:abstractNum w:abstractNumId="38" w15:restartNumberingAfterBreak="0">
+    <w:multiLevelType w:val="hybridMultilevel"/>
+    <w:lvl w:ilvl="0" w15:tentative="1">
+      <w:start w:val="1"/>
+      <w:numFmt w:val="bullet"/>
+      <w:lvlText w:val="•"/>
+      <w:lvlJc w:val="left"/>
+      <w:pPr>
+        <w:ind w:left="720" w:hanging="360"/>
+      </w:pPr>
+    </w:lvl>
+  </w:abstractNum>
+  <w:abstractNum w:abstractNumId="39" w15:restartNumberingAfterBreak="0">
+    <w:multiLevelType w:val="hybridMultilevel"/>
+    <w:lvl w:ilvl="0" w15:tentative="1">
+      <w:start w:val="1"/>
+      <w:numFmt w:val="decimal"/>
+      <w:lvlText w:val="%1."/>
+      <w:lvlJc w:val="left"/>
+      <w:pPr>
+        <w:ind w:left="720" w:hanging="360"/>
+      </w:pPr>
+    </w:lvl>
+  </w:abstractNum>
+  <w:abstractNum w:abstractNumId="40" w15:restartNumberingAfterBreak="0">
+    <w:multiLevelType w:val="hybridMultilevel"/>
+    <w:lvl w:ilvl="0" w15:tentative="1">
+      <w:start w:val="1"/>
+      <w:numFmt w:val="bullet"/>
+      <w:lvlText w:val="•"/>
+      <w:lvlJc w:val="left"/>
+      <w:pPr>
+        <w:ind w:left="720" w:hanging="360"/>
+      </w:pPr>
+    </w:lvl>
+  </w:abstractNum>
+  <w:abstractNum w:abstractNumId="41" w15:restartNumberingAfterBreak="0">
+    <w:multiLevelType w:val="hybridMultilevel"/>
+    <w:lvl w:ilvl="0" w15:tentative="1">
+      <w:start w:val="1"/>
+      <w:numFmt w:val="decimal"/>
+      <w:lvlText w:val="%1."/>
+      <w:lvlJc w:val="left"/>
+      <w:pPr>
+        <w:ind w:left="720" w:hanging="360"/>
+      </w:pPr>
+    </w:lvl>
+  </w:abstractNum>
+  <w:abstractNum w:abstractNumId="42" w15:restartNumberingAfterBreak="0">
+    <w:multiLevelType w:val="hybridMultilevel"/>
+    <w:lvl w:ilvl="0" w15:tentative="1">
+      <w:start w:val="1"/>
+      <w:numFmt w:val="bullet"/>
+      <w:lvlText w:val="•"/>
+      <w:lvlJc w:val="left"/>
+      <w:pPr>
+        <w:ind w:left="720" w:hanging="360"/>
+      </w:pPr>
+    </w:lvl>
+  </w:abstractNum>
+  <w:abstractNum w:abstractNumId="43" w15:restartNumberingAfterBreak="0">
+    <w:multiLevelType w:val="hybridMultilevel"/>
+    <w:lvl w:ilvl="0" w15:tentative="1">
+      <w:start w:val="1"/>
+      <w:numFmt w:val="decimal"/>
+      <w:lvlText w:val="%1."/>
+      <w:lvlJc w:val="left"/>
+      <w:pPr>
+        <w:ind w:left="720" w:hanging="360"/>
+      </w:pPr>
+    </w:lvl>
+  </w:abstractNum>
+  <w:abstractNum w:abstractNumId="44" w15:restartNumberingAfterBreak="0">
+    <w:multiLevelType w:val="hybridMultilevel"/>
+    <w:lvl w:ilvl="0" w15:tentative="1">
+      <w:start w:val="1"/>
+      <w:numFmt w:val="bullet"/>
+      <w:lvlText w:val="•"/>
+      <w:lvlJc w:val="left"/>
+      <w:pPr>
+        <w:ind w:left="720" w:hanging="360"/>
+      </w:pPr>
+    </w:lvl>
+  </w:abstractNum>
+  <w:abstractNum w:abstractNumId="45" w15:restartNumberingAfterBreak="0">
+    <w:multiLevelType w:val="hybridMultilevel"/>
+    <w:lvl w:ilvl="0" w15:tentative="1">
+      <w:start w:val="1"/>
+      <w:numFmt w:val="decimal"/>
+      <w:lvlText w:val="%1."/>
+      <w:lvlJc w:val="left"/>
+      <w:pPr>
+        <w:ind w:left="720" w:hanging="360"/>
+      </w:pPr>
+    </w:lvl>
+  </w:abstractNum>
+  <w:abstractNum w:abstractNumId="46" w15:restartNumberingAfterBreak="0">
+    <w:multiLevelType w:val="hybridMultilevel"/>
+    <w:lvl w:ilvl="0" w15:tentative="1">
+      <w:start w:val="1"/>
+      <w:numFmt w:val="bullet"/>
+      <w:lvlText w:val="•"/>
+      <w:lvlJc w:val="left"/>
+      <w:pPr>
+        <w:ind w:left="720" w:hanging="360"/>
+      </w:pPr>
+    </w:lvl>
+  </w:abstractNum>
+  <w:abstractNum w:abstractNumId="47" w15:restartNumberingAfterBreak="0">
+    <w:multiLevelType w:val="hybridMultilevel"/>
+    <w:lvl w:ilvl="0" w15:tentative="1">
+      <w:start w:val="1"/>
+      <w:numFmt w:val="decimal"/>
+      <w:lvlText w:val="%1."/>
+      <w:lvlJc w:val="left"/>
+      <w:pPr>
+        <w:ind w:left="720" w:hanging="360"/>
+      </w:pPr>
+    </w:lvl>
+  </w:abstractNum>
+  <w:abstractNum w:abstractNumId="48" w15:restartNumberingAfterBreak="0">
+    <w:multiLevelType w:val="hybridMultilevel"/>
+    <w:lvl w:ilvl="0" w15:tentative="1">
+      <w:start w:val="1"/>
+      <w:numFmt w:val="bullet"/>
+      <w:lvlText w:val="•"/>
+      <w:lvlJc w:val="left"/>
+      <w:pPr>
+        <w:ind w:left="720" w:hanging="360"/>
+      </w:pPr>
+    </w:lvl>
+  </w:abstractNum>
+  <w:abstractNum w:abstractNumId="49" w15:restartNumberingAfterBreak="0">
+    <w:multiLevelType w:val="hybridMultilevel"/>
+    <w:lvl w:ilvl="0" w15:tentative="1">
+      <w:start w:val="1"/>
+      <w:numFmt w:val="decimal"/>
+      <w:lvlText w:val="%1."/>
+      <w:lvlJc w:val="left"/>
+      <w:pPr>
+        <w:ind w:left="720" w:hanging="360"/>
+      </w:pPr>
+    </w:lvl>
+  </w:abstractNum>
+  <w:abstractNum w:abstractNumId="50" w15:restartNumberingAfterBreak="0">
+    <w:multiLevelType w:val="hybridMultilevel"/>
+    <w:lvl w:ilvl="0" w15:tentative="1">
+      <w:start w:val="1"/>
+      <w:numFmt w:val="bullet"/>
+      <w:lvlText w:val="•"/>
+      <w:lvlJc w:val="left"/>
+      <w:pPr>
+        <w:ind w:left="720" w:hanging="360"/>
+      </w:pPr>
+    </w:lvl>
+  </w:abstractNum>
+  <w:abstractNum w:abstractNumId="51" w15:restartNumberingAfterBreak="0">
+    <w:multiLevelType w:val="hybridMultilevel"/>
+    <w:lvl w:ilvl="0" w15:tentative="1">
+      <w:start w:val="1"/>
+      <w:numFmt w:val="decimal"/>
+      <w:lvlText w:val="%1."/>
       <w:lvlJc w:val="left"/>
       <w:pPr>
         <w:ind w:left="720" w:hanging="360"/>
@@ -4083,85 +4764,103 @@
     </w:lvlOverride>
   </w:num>
   <w:num w:numId="2">
-    <w:abstractNumId w:val="5"/>
+    <w:abstractNumId w:val="2"/>
     <w:lvlOverride w:ilvl="0">
       <w:startOverride w:val="1"/>
     </w:lvlOverride>
   </w:num>
   <w:num w:numId="3">
+    <w:abstractNumId w:val="10"/>
+    <w:lvlOverride w:ilvl="0">
+      <w:startOverride w:val="1"/>
+    </w:lvlOverride>
+  </w:num>
+  <w:num w:numId="4">
+    <w:abstractNumId w:val="12"/>
+    <w:lvlOverride w:ilvl="0">
+      <w:startOverride w:val="1"/>
+    </w:lvlOverride>
+  </w:num>
+  <w:num w:numId="5">
+    <w:abstractNumId w:val="14"/>
+    <w:lvlOverride w:ilvl="0">
+      <w:startOverride w:val="1"/>
+    </w:lvlOverride>
+  </w:num>
+  <w:num w:numId="6">
+    <w:abstractNumId w:val="16"/>
+    <w:lvlOverride w:ilvl="0">
+      <w:startOverride w:val="1"/>
+    </w:lvlOverride>
+  </w:num>
+  <w:num w:numId="7">
     <w:abstractNumId w:val="6"/>
     <w:lvlOverride w:ilvl="0">
       <w:startOverride w:val="1"/>
     </w:lvlOverride>
   </w:num>
-  <w:num w:numId="4">
-    <w:abstractNumId w:val="7"/>
-    <w:lvlOverride w:ilvl="0">
-      <w:startOverride w:val="1"/>
-    </w:lvlOverride>
-  </w:num>
-  <w:num w:numId="5">
+  <w:num w:numId="8">
     <w:abstractNumId w:val="8"/>
     <w:lvlOverride w:ilvl="0">
       <w:startOverride w:val="1"/>
     </w:lvlOverride>
   </w:num>
-  <w:num w:numId="6">
-    <w:abstractNumId w:val="9"/>
-    <w:lvlOverride w:ilvl="0">
-      <w:startOverride w:val="1"/>
-    </w:lvlOverride>
-  </w:num>
-  <w:num w:numId="7">
-    <w:abstractNumId w:val="10"/>
-    <w:lvlOverride w:ilvl="0">
-      <w:startOverride w:val="1"/>
-    </w:lvlOverride>
-  </w:num>
-  <w:num w:numId="8">
-    <w:abstractNumId w:val="11"/>
-    <w:lvlOverride w:ilvl="0">
-      <w:startOverride w:val="1"/>
-    </w:lvlOverride>
-  </w:num>
   <w:num w:numId="9">
-    <w:abstractNumId w:val="12"/>
+    <w:abstractNumId w:val="18"/>
     <w:lvlOverride w:ilvl="0">
       <w:startOverride w:val="1"/>
     </w:lvlOverride>
   </w:num>
   <w:num w:numId="10">
-    <w:abstractNumId w:val="13"/>
+    <w:abstractNumId w:val="21"/>
     <w:lvlOverride w:ilvl="0">
       <w:startOverride w:val="1"/>
     </w:lvlOverride>
   </w:num>
   <w:num w:numId="11">
-    <w:abstractNumId w:val="14"/>
+    <w:abstractNumId w:val="22"/>
     <w:lvlOverride w:ilvl="0">
       <w:startOverride w:val="1"/>
     </w:lvlOverride>
   </w:num>
   <w:num w:numId="12">
-    <w:abstractNumId w:val="16"/>
+    <w:abstractNumId w:val="25"/>
     <w:lvlOverride w:ilvl="0">
       <w:startOverride w:val="1"/>
     </w:lvlOverride>
   </w:num>
   <w:num w:numId="13">
-    <w:abstractNumId w:val="17"/>
+    <w:abstractNumId w:val="27"/>
     <w:lvlOverride w:ilvl="0">
       <w:startOverride w:val="1"/>
     </w:lvlOverride>
   </w:num>
   <w:num w:numId="14">
-    <w:abstractNumId w:val="18"/>
+    <w:abstractNumId w:val="28"/>
     <w:lvlOverride w:ilvl="0">
       <w:startOverride w:val="1"/>
     </w:lvlOverride>
   </w:num>
   <w:num w:numId="15">
-    <w:abstractNumId w:val="19"/>
+    <w:abstractNumId w:val="30"/>
+    <w:lvlOverride w:ilvl="0">
+      <w:startOverride w:val="1"/>
+    </w:lvlOverride>
+  </w:num>
+  <w:num w:numId="16">
+    <w:abstractNumId w:val="32"/>
+    <w:lvlOverride w:ilvl="0">
+      <w:startOverride w:val="1"/>
+    </w:lvlOverride>
+  </w:num>
+  <w:num w:numId="17">
+    <w:abstractNumId w:val="34"/>
+    <w:lvlOverride w:ilvl="0">
+      <w:startOverride w:val="1"/>
+    </w:lvlOverride>
+  </w:num>
+  <w:num w:numId="18">
+    <w:abstractNumId w:val="36"/>
     <w:lvlOverride w:ilvl="0">
       <w:startOverride w:val="1"/>
     </w:lvlOverride>

</xml_diff>

<commit_message>
Update Word doc and zip with sidebar card change (Leading + PT circle logo)
</commit_message>
<xml_diff>
--- a/Perspective-Tester-Microsite-Content-Reference.docx
+++ b/Perspective-Tester-Microsite-Content-Reference.docx
@@ -658,6 +658,34 @@
         </w:rPr>
         <w:t xml:space="preserve">Sidebar Content</w:t>
       </w:r>
+    </w:p>
+    <w:p>
+      <w:pPr>
+        <w:spacing w:after="80"/>
+      </w:pPr>
+      <w:r>
+        <w:rPr>
+          <w:rFonts w:ascii="Arial" w:cs="Arial" w:eastAsia="Arial" w:hAnsi="Arial"/>
+          <w:b/>
+          <w:bCs/>
+          <w:sz w:val="21"/>
+          <w:szCs w:val="21"/>
+        </w:rPr>
+        <w:t xml:space="preserve">Sidebar Card: </w:t>
+      </w:r>
+      <w:r>
+        <w:rPr>
+          <w:rFonts w:ascii="Arial" w:cs="Arial" w:eastAsia="Arial" w:hAnsi="Arial"/>
+          <w:sz w:val="21"/>
+          <w:szCs w:val="21"/>
+        </w:rPr>
+        <w:t xml:space="preserve">Leading the future of digital accessibility. (with circular Perspective Tester logo)</w:t>
+      </w:r>
+    </w:p>
+    <w:p>
+      <w:pPr>
+        <w:spacing w:before="100"/>
+      </w:pPr>
     </w:p>
     <w:p>
       <w:pPr>

</xml_diff>